<commit_message>
MOL-voorbereiding, ouders, studievaardigheden, groepsvorming
Co-Authored-By: Claude Opus 5 <noreply@anthropic.com>
Claude-Session: https://claude.ai/code/session_01ANGbdbaxhJNxHHij1urWpj
</commit_message>
<xml_diff>
--- a/Jaarplanner_leerlingen_H4E_2026-2027.docx
+++ b/Jaarplanner_leerlingen_H4E_2026-2027.docx
@@ -1184,7 +1184,7 @@
                 <w:sz w:val="18"/>
                 <w:szCs w:val="18"/>
               </w:rPr>
-              <w:t xml:space="preserve">vr 20 nov</w:t>
+              <w:t xml:space="preserve">vóór elk MOL-gesprek</w:t>
             </w:r>
           </w:p>
         </w:tc>
@@ -1216,7 +1216,7 @@
                 <w:sz w:val="18"/>
                 <w:szCs w:val="18"/>
               </w:rPr>
-              <w:t xml:space="preserve">PDF van je terugblik op toetsweek A</w:t>
+              <w:t xml:space="preserve">Voorbereiding MOL-gesprek in de tool: je spiekkaart. Laat hem thuis zien; je ouder of verzorger typt een korte reactie.</w:t>
             </w:r>
           </w:p>
         </w:tc>
@@ -1252,7 +1252,7 @@
                 <w:sz w:val="18"/>
                 <w:szCs w:val="18"/>
               </w:rPr>
-              <w:t xml:space="preserve">vr 4 dec</w:t>
+              <w:t xml:space="preserve">vr 20 nov</w:t>
             </w:r>
           </w:p>
         </w:tc>
@@ -1284,7 +1284,7 @@
                 <w:sz w:val="18"/>
                 <w:szCs w:val="18"/>
               </w:rPr>
-              <w:t xml:space="preserve">LOB deel 1 in Magister</w:t>
+              <w:t xml:space="preserve">PDF van je terugblik op toetsweek A</w:t>
             </w:r>
           </w:p>
         </w:tc>
@@ -1320,7 +1320,7 @@
                 <w:sz w:val="18"/>
                 <w:szCs w:val="18"/>
               </w:rPr>
-              <w:t xml:space="preserve">vr 12 feb</w:t>
+              <w:t xml:space="preserve">vr 4 dec</w:t>
             </w:r>
           </w:p>
         </w:tc>
@@ -1352,7 +1352,7 @@
                 <w:sz w:val="18"/>
                 <w:szCs w:val="18"/>
               </w:rPr>
-              <w:t xml:space="preserve">PDF van je tussenbalans (voor MOL-gesprek 2)</w:t>
+              <w:t xml:space="preserve">LOB deel 1 in Magister</w:t>
             </w:r>
           </w:p>
         </w:tc>
@@ -1388,7 +1388,7 @@
                 <w:sz w:val="18"/>
                 <w:szCs w:val="18"/>
               </w:rPr>
-              <w:t xml:space="preserve">vr 19 mrt</w:t>
+              <w:t xml:space="preserve">vr 12 feb</w:t>
             </w:r>
           </w:p>
         </w:tc>
@@ -1420,7 +1420,7 @@
                 <w:sz w:val="18"/>
                 <w:szCs w:val="18"/>
               </w:rPr>
-              <w:t xml:space="preserve">LOB deel 2 in Magister · PDF van je toetsweekplan C (voor MOL-gesprek 3)</w:t>
+              <w:t xml:space="preserve">PDF van je tussenbalans (voor MOL-gesprek 2)</w:t>
             </w:r>
           </w:p>
         </w:tc>
@@ -1456,7 +1456,7 @@
                 <w:sz w:val="18"/>
                 <w:szCs w:val="18"/>
               </w:rPr>
-              <w:t xml:space="preserve">week 21 – 22</w:t>
+              <w:t xml:space="preserve">vr 19 mrt</w:t>
             </w:r>
           </w:p>
         </w:tc>
@@ -1488,7 +1488,7 @@
                 <w:sz w:val="18"/>
                 <w:szCs w:val="18"/>
               </w:rPr>
-              <w:t xml:space="preserve">Je eindpitch</w:t>
+              <w:t xml:space="preserve">LOB deel 2 in Magister · PDF van je toetsweekplan C (voor MOL-gesprek 3)</w:t>
             </w:r>
           </w:p>
         </w:tc>
@@ -1524,6 +1524,74 @@
                 <w:sz w:val="18"/>
                 <w:szCs w:val="18"/>
               </w:rPr>
+              <w:t xml:space="preserve">week 21 – 22</w:t>
+            </w:r>
+          </w:p>
+        </w:tc>
+        <w:tc>
+          <w:tcPr>
+            <w:tcW w:type="dxa" w:w="11398"/>
+            <w:tcBorders>
+              <w:top w:val="single" w:color="C9C4B5" w:sz="4"/>
+              <w:left w:val="single" w:color="C9C4B5" w:sz="4"/>
+              <w:bottom w:val="single" w:color="C9C4B5" w:sz="4"/>
+              <w:right w:val="single" w:color="C9C4B5" w:sz="4"/>
+            </w:tcBorders>
+            <w:tcMar>
+              <w:top w:type="dxa" w:w="60"/>
+              <w:left w:type="dxa" w:w="90"/>
+              <w:bottom w:type="dxa" w:w="60"/>
+              <w:right w:type="dxa" w:w="90"/>
+            </w:tcMar>
+            <w:vAlign w:val="top"/>
+          </w:tcPr>
+          <w:p>
+            <w:pPr>
+              <w:spacing w:after="40"/>
+            </w:pPr>
+            <w:r>
+              <w:rPr>
+                <w:rFonts w:ascii="Calibri" w:cs="Calibri" w:eastAsia="Calibri" w:hAnsi="Calibri"/>
+                <w:color w:val="1F2328"/>
+                <w:sz w:val="18"/>
+                <w:szCs w:val="18"/>
+              </w:rPr>
+              <w:t xml:space="preserve">Je eindpitch</w:t>
+            </w:r>
+          </w:p>
+        </w:tc>
+      </w:tr>
+      <w:tr>
+        <w:tc>
+          <w:tcPr>
+            <w:tcW w:type="dxa" w:w="4000"/>
+            <w:tcBorders>
+              <w:top w:val="single" w:color="C9C4B5" w:sz="4"/>
+              <w:left w:val="single" w:color="C9C4B5" w:sz="4"/>
+              <w:bottom w:val="single" w:color="C9C4B5" w:sz="4"/>
+              <w:right w:val="single" w:color="C9C4B5" w:sz="4"/>
+            </w:tcBorders>
+            <w:tcMar>
+              <w:top w:type="dxa" w:w="60"/>
+              <w:left w:type="dxa" w:w="90"/>
+              <w:bottom w:type="dxa" w:w="60"/>
+              <w:right w:type="dxa" w:w="90"/>
+            </w:tcMar>
+            <w:vAlign w:val="top"/>
+          </w:tcPr>
+          <w:p>
+            <w:pPr>
+              <w:spacing w:after="40"/>
+            </w:pPr>
+            <w:r>
+              <w:rPr>
+                <w:rFonts w:ascii="Calibri" w:cs="Calibri" w:eastAsia="Calibri" w:hAnsi="Calibri"/>
+                <w:b/>
+                <w:bCs/>
+                <w:color w:val="1F2328"/>
+                <w:sz w:val="18"/>
+                <w:szCs w:val="18"/>
+              </w:rPr>
               <w:t xml:space="preserve">vr 2 jul</w:t>
             </w:r>
           </w:p>
@@ -1557,6 +1625,569 @@
                 <w:szCs w:val="18"/>
               </w:rPr>
               <w:t xml:space="preserve">PDF van je eindbalans</w:t>
+            </w:r>
+          </w:p>
+        </w:tc>
+      </w:tr>
+    </w:tbl>
+    <w:p>
+      <w:pPr>
+        <w:pStyle w:val="Heading2"/>
+        <w:keepNext/>
+        <w:spacing w:after="100" w:before="200"/>
+      </w:pPr>
+      <w:r>
+        <w:rPr>
+          <w:rFonts w:ascii="Calibri" w:cs="Calibri" w:eastAsia="Calibri" w:hAnsi="Calibri"/>
+        </w:rPr>
+        <w:t xml:space="preserve">In het MOL-gesprek ben jij aan het woord</w:t>
+      </w:r>
+    </w:p>
+    <w:p>
+      <w:pPr>
+        <w:spacing w:after="100" w:before="0" w:line="276"/>
+      </w:pPr>
+      <w:r>
+        <w:rPr>
+          <w:rFonts w:ascii="Calibri" w:cs="Calibri" w:eastAsia="Calibri" w:hAnsi="Calibri"/>
+          <w:color w:val="1F2328"/>
+          <w:sz w:val="20"/>
+          <w:szCs w:val="20"/>
+        </w:rPr>
+        <w:t xml:space="preserve">Je legt je plan voor en je legt uit waarom het een goed plan is: met twee argumenten en bewijs. Je bereidt dat voor in de tool en neemt je spiekkaart mee. Laat je plan vóór het gesprek thuis zien. Na elke toetsweek laat je je terugblik ook thuis zien.</w:t>
+      </w:r>
+    </w:p>
+    <w:p>
+      <w:pPr>
+        <w:pStyle w:val="Heading2"/>
+        <w:keepNext/>
+        <w:spacing w:after="100" w:before="200"/>
+      </w:pPr>
+      <w:r>
+        <w:rPr>
+          <w:rFonts w:ascii="Calibri" w:cs="Calibri" w:eastAsia="Calibri" w:hAnsi="Calibri"/>
+        </w:rPr>
+        <w:t xml:space="preserve">Studievaardigheden: als je klaar bent met je lesopdracht</w:t>
+      </w:r>
+    </w:p>
+    <w:tbl>
+      <w:tblPr>
+        <w:tblW w:type="dxa" w:w="15398"/>
+        <w:tblBorders>
+          <w:top w:val="single" w:color="auto" w:sz="4"/>
+          <w:left w:val="single" w:color="auto" w:sz="4"/>
+          <w:bottom w:val="single" w:color="auto" w:sz="4"/>
+          <w:right w:val="single" w:color="auto" w:sz="4"/>
+          <w:insideH w:val="single" w:color="auto" w:sz="4"/>
+          <w:insideV w:val="single" w:color="auto" w:sz="4"/>
+        </w:tblBorders>
+      </w:tblPr>
+      <w:tblGrid>
+        <w:gridCol w:w="3200"/>
+        <w:gridCol w:w="4000"/>
+        <w:gridCol w:w="8198"/>
+      </w:tblGrid>
+      <w:tr>
+        <w:tc>
+          <w:tcPr>
+            <w:tcW w:type="dxa" w:w="3200"/>
+            <w:tcBorders>
+              <w:top w:val="single" w:color="C9C4B5" w:sz="4"/>
+              <w:left w:val="single" w:color="C9C4B5" w:sz="4"/>
+              <w:bottom w:val="single" w:color="C9C4B5" w:sz="4"/>
+              <w:right w:val="single" w:color="C9C4B5" w:sz="4"/>
+            </w:tcBorders>
+            <w:shd w:fill="F8EFD2" w:color="auto" w:val="clear"/>
+            <w:tcMar>
+              <w:top w:type="dxa" w:w="60"/>
+              <w:left w:type="dxa" w:w="90"/>
+              <w:bottom w:type="dxa" w:w="60"/>
+              <w:right w:type="dxa" w:w="90"/>
+            </w:tcMar>
+            <w:vAlign w:val="top"/>
+          </w:tcPr>
+          <w:p>
+            <w:pPr>
+              <w:spacing w:after="40"/>
+            </w:pPr>
+            <w:r>
+              <w:rPr>
+                <w:rFonts w:ascii="Calibri" w:cs="Calibri" w:eastAsia="Calibri" w:hAnsi="Calibri"/>
+                <w:b/>
+                <w:bCs/>
+                <w:color w:val="1F2328"/>
+                <w:sz w:val="18"/>
+                <w:szCs w:val="18"/>
+              </w:rPr>
+              <w:t xml:space="preserve">Nulmeting</w:t>
+            </w:r>
+          </w:p>
+        </w:tc>
+        <w:tc>
+          <w:tcPr>
+            <w:tcW w:type="dxa" w:w="4000"/>
+            <w:tcBorders>
+              <w:top w:val="single" w:color="C9C4B5" w:sz="4"/>
+              <w:left w:val="single" w:color="C9C4B5" w:sz="4"/>
+              <w:bottom w:val="single" w:color="C9C4B5" w:sz="4"/>
+              <w:right w:val="single" w:color="C9C4B5" w:sz="4"/>
+            </w:tcBorders>
+            <w:tcMar>
+              <w:top w:type="dxa" w:w="60"/>
+              <w:left w:type="dxa" w:w="90"/>
+              <w:bottom w:type="dxa" w:w="60"/>
+              <w:right w:type="dxa" w:w="90"/>
+            </w:tcMar>
+            <w:vAlign w:val="top"/>
+          </w:tcPr>
+          <w:p>
+            <w:pPr>
+              <w:spacing w:after="40"/>
+            </w:pPr>
+            <w:r>
+              <w:rPr>
+                <w:rFonts w:ascii="Calibri" w:cs="Calibri" w:eastAsia="Calibri" w:hAnsi="Calibri"/>
+                <w:color w:val="1F2328"/>
+                <w:sz w:val="18"/>
+                <w:szCs w:val="18"/>
+              </w:rPr>
+              <w:t xml:space="preserve">september en begin oktober</w:t>
+            </w:r>
+          </w:p>
+        </w:tc>
+        <w:tc>
+          <w:tcPr>
+            <w:tcW w:type="dxa" w:w="8198"/>
+            <w:tcBorders>
+              <w:top w:val="single" w:color="C9C4B5" w:sz="4"/>
+              <w:left w:val="single" w:color="C9C4B5" w:sz="4"/>
+              <w:bottom w:val="single" w:color="C9C4B5" w:sz="4"/>
+              <w:right w:val="single" w:color="C9C4B5" w:sz="4"/>
+            </w:tcBorders>
+            <w:tcMar>
+              <w:top w:type="dxa" w:w="60"/>
+              <w:left w:type="dxa" w:w="90"/>
+              <w:bottom w:type="dxa" w:w="60"/>
+              <w:right w:type="dxa" w:w="90"/>
+            </w:tcMar>
+            <w:vAlign w:val="top"/>
+          </w:tcPr>
+          <w:p>
+            <w:pPr>
+              <w:spacing w:after="40"/>
+            </w:pPr>
+            <w:r>
+              <w:rPr>
+                <w:rFonts w:ascii="Calibri" w:cs="Calibri" w:eastAsia="Calibri" w:hAnsi="Calibri"/>
+                <w:color w:val="1F2328"/>
+                <w:sz w:val="18"/>
+                <w:szCs w:val="18"/>
+              </w:rPr>
+              <w:t xml:space="preserve">Hoe goed lukken jouw executieve functies (zoals op gang komen en plannen)? Hoe leer je nu, en werkt dat? Geef bewijs.</w:t>
+            </w:r>
+          </w:p>
+        </w:tc>
+      </w:tr>
+      <w:tr>
+        <w:tc>
+          <w:tcPr>
+            <w:tcW w:type="dxa" w:w="3200"/>
+            <w:tcBorders>
+              <w:top w:val="single" w:color="C9C4B5" w:sz="4"/>
+              <w:left w:val="single" w:color="C9C4B5" w:sz="4"/>
+              <w:bottom w:val="single" w:color="C9C4B5" w:sz="4"/>
+              <w:right w:val="single" w:color="C9C4B5" w:sz="4"/>
+            </w:tcBorders>
+            <w:shd w:fill="F8EFD2" w:color="auto" w:val="clear"/>
+            <w:tcMar>
+              <w:top w:type="dxa" w:w="60"/>
+              <w:left w:type="dxa" w:w="90"/>
+              <w:bottom w:type="dxa" w:w="60"/>
+              <w:right w:type="dxa" w:w="90"/>
+            </w:tcMar>
+            <w:vAlign w:val="top"/>
+          </w:tcPr>
+          <w:p>
+            <w:pPr>
+              <w:spacing w:after="40"/>
+            </w:pPr>
+            <w:r>
+              <w:rPr>
+                <w:rFonts w:ascii="Calibri" w:cs="Calibri" w:eastAsia="Calibri" w:hAnsi="Calibri"/>
+                <w:b/>
+                <w:bCs/>
+                <w:color w:val="1F2328"/>
+                <w:sz w:val="18"/>
+                <w:szCs w:val="18"/>
+              </w:rPr>
+              <w:t xml:space="preserve">Ronde 1</w:t>
+            </w:r>
+          </w:p>
+        </w:tc>
+        <w:tc>
+          <w:tcPr>
+            <w:tcW w:type="dxa" w:w="4000"/>
+            <w:tcBorders>
+              <w:top w:val="single" w:color="C9C4B5" w:sz="4"/>
+              <w:left w:val="single" w:color="C9C4B5" w:sz="4"/>
+              <w:bottom w:val="single" w:color="C9C4B5" w:sz="4"/>
+              <w:right w:val="single" w:color="C9C4B5" w:sz="4"/>
+            </w:tcBorders>
+            <w:tcMar>
+              <w:top w:type="dxa" w:w="60"/>
+              <w:left w:type="dxa" w:w="90"/>
+              <w:bottom w:type="dxa" w:w="60"/>
+              <w:right w:type="dxa" w:w="90"/>
+            </w:tcMar>
+            <w:vAlign w:val="top"/>
+          </w:tcPr>
+          <w:p>
+            <w:pPr>
+              <w:spacing w:after="40"/>
+            </w:pPr>
+            <w:r>
+              <w:rPr>
+                <w:rFonts w:ascii="Calibri" w:cs="Calibri" w:eastAsia="Calibri" w:hAnsi="Calibri"/>
+                <w:color w:val="1F2328"/>
+                <w:sz w:val="18"/>
+                <w:szCs w:val="18"/>
+              </w:rPr>
+              <w:t xml:space="preserve">oktober tot en met toetsweek A</w:t>
+            </w:r>
+          </w:p>
+        </w:tc>
+        <w:tc>
+          <w:tcPr>
+            <w:tcW w:type="dxa" w:w="8198"/>
+            <w:tcBorders>
+              <w:top w:val="single" w:color="C9C4B5" w:sz="4"/>
+              <w:left w:val="single" w:color="C9C4B5" w:sz="4"/>
+              <w:bottom w:val="single" w:color="C9C4B5" w:sz="4"/>
+              <w:right w:val="single" w:color="C9C4B5" w:sz="4"/>
+            </w:tcBorders>
+            <w:tcMar>
+              <w:top w:type="dxa" w:w="60"/>
+              <w:left w:type="dxa" w:w="90"/>
+              <w:bottom w:type="dxa" w:w="60"/>
+              <w:right w:type="dxa" w:w="90"/>
+            </w:tcMar>
+            <w:vAlign w:val="top"/>
+          </w:tcPr>
+          <w:p>
+            <w:pPr>
+              <w:spacing w:after="40"/>
+            </w:pPr>
+            <w:r>
+              <w:rPr>
+                <w:rFonts w:ascii="Calibri" w:cs="Calibri" w:eastAsia="Calibri" w:hAnsi="Calibri"/>
+                <w:color w:val="1F2328"/>
+                <w:sz w:val="18"/>
+                <w:szCs w:val="18"/>
+              </w:rPr>
+              <w:t xml:space="preserve">Kies een nieuwe manier van leren, oefen ermee, houd een logboek bij en beschrijf hoe het ging.</w:t>
+            </w:r>
+          </w:p>
+        </w:tc>
+      </w:tr>
+      <w:tr>
+        <w:tc>
+          <w:tcPr>
+            <w:tcW w:type="dxa" w:w="3200"/>
+            <w:tcBorders>
+              <w:top w:val="single" w:color="C9C4B5" w:sz="4"/>
+              <w:left w:val="single" w:color="C9C4B5" w:sz="4"/>
+              <w:bottom w:val="single" w:color="C9C4B5" w:sz="4"/>
+              <w:right w:val="single" w:color="C9C4B5" w:sz="4"/>
+            </w:tcBorders>
+            <w:shd w:fill="F8EFD2" w:color="auto" w:val="clear"/>
+            <w:tcMar>
+              <w:top w:type="dxa" w:w="60"/>
+              <w:left w:type="dxa" w:w="90"/>
+              <w:bottom w:type="dxa" w:w="60"/>
+              <w:right w:type="dxa" w:w="90"/>
+            </w:tcMar>
+            <w:vAlign w:val="top"/>
+          </w:tcPr>
+          <w:p>
+            <w:pPr>
+              <w:spacing w:after="40"/>
+            </w:pPr>
+            <w:r>
+              <w:rPr>
+                <w:rFonts w:ascii="Calibri" w:cs="Calibri" w:eastAsia="Calibri" w:hAnsi="Calibri"/>
+                <w:b/>
+                <w:bCs/>
+                <w:color w:val="1F2328"/>
+                <w:sz w:val="18"/>
+                <w:szCs w:val="18"/>
+              </w:rPr>
+              <w:t xml:space="preserve">Ronde 2</w:t>
+            </w:r>
+          </w:p>
+        </w:tc>
+        <w:tc>
+          <w:tcPr>
+            <w:tcW w:type="dxa" w:w="4000"/>
+            <w:tcBorders>
+              <w:top w:val="single" w:color="C9C4B5" w:sz="4"/>
+              <w:left w:val="single" w:color="C9C4B5" w:sz="4"/>
+              <w:bottom w:val="single" w:color="C9C4B5" w:sz="4"/>
+              <w:right w:val="single" w:color="C9C4B5" w:sz="4"/>
+            </w:tcBorders>
+            <w:tcMar>
+              <w:top w:type="dxa" w:w="60"/>
+              <w:left w:type="dxa" w:w="90"/>
+              <w:bottom w:type="dxa" w:w="60"/>
+              <w:right w:type="dxa" w:w="90"/>
+            </w:tcMar>
+            <w:vAlign w:val="top"/>
+          </w:tcPr>
+          <w:p>
+            <w:pPr>
+              <w:spacing w:after="40"/>
+            </w:pPr>
+            <w:r>
+              <w:rPr>
+                <w:rFonts w:ascii="Calibri" w:cs="Calibri" w:eastAsia="Calibri" w:hAnsi="Calibri"/>
+                <w:color w:val="1F2328"/>
+                <w:sz w:val="18"/>
+                <w:szCs w:val="18"/>
+              </w:rPr>
+              <w:t xml:space="preserve">november tot en met toetsweek B</w:t>
+            </w:r>
+          </w:p>
+        </w:tc>
+        <w:tc>
+          <w:tcPr>
+            <w:tcW w:type="dxa" w:w="8198"/>
+            <w:tcBorders>
+              <w:top w:val="single" w:color="C9C4B5" w:sz="4"/>
+              <w:left w:val="single" w:color="C9C4B5" w:sz="4"/>
+              <w:bottom w:val="single" w:color="C9C4B5" w:sz="4"/>
+              <w:right w:val="single" w:color="C9C4B5" w:sz="4"/>
+            </w:tcBorders>
+            <w:tcMar>
+              <w:top w:type="dxa" w:w="60"/>
+              <w:left w:type="dxa" w:w="90"/>
+              <w:bottom w:type="dxa" w:w="60"/>
+              <w:right w:type="dxa" w:w="90"/>
+            </w:tcMar>
+            <w:vAlign w:val="top"/>
+          </w:tcPr>
+          <w:p>
+            <w:pPr>
+              <w:spacing w:after="40"/>
+            </w:pPr>
+            <w:r>
+              <w:rPr>
+                <w:rFonts w:ascii="Calibri" w:cs="Calibri" w:eastAsia="Calibri" w:hAnsi="Calibri"/>
+                <w:color w:val="1F2328"/>
+                <w:sz w:val="18"/>
+                <w:szCs w:val="18"/>
+              </w:rPr>
+              <w:t xml:space="preserve">Een tweede nieuwe manier.</w:t>
+            </w:r>
+          </w:p>
+        </w:tc>
+      </w:tr>
+      <w:tr>
+        <w:tc>
+          <w:tcPr>
+            <w:tcW w:type="dxa" w:w="3200"/>
+            <w:tcBorders>
+              <w:top w:val="single" w:color="C9C4B5" w:sz="4"/>
+              <w:left w:val="single" w:color="C9C4B5" w:sz="4"/>
+              <w:bottom w:val="single" w:color="C9C4B5" w:sz="4"/>
+              <w:right w:val="single" w:color="C9C4B5" w:sz="4"/>
+            </w:tcBorders>
+            <w:shd w:fill="F8EFD2" w:color="auto" w:val="clear"/>
+            <w:tcMar>
+              <w:top w:type="dxa" w:w="60"/>
+              <w:left w:type="dxa" w:w="90"/>
+              <w:bottom w:type="dxa" w:w="60"/>
+              <w:right w:type="dxa" w:w="90"/>
+            </w:tcMar>
+            <w:vAlign w:val="top"/>
+          </w:tcPr>
+          <w:p>
+            <w:pPr>
+              <w:spacing w:after="40"/>
+            </w:pPr>
+            <w:r>
+              <w:rPr>
+                <w:rFonts w:ascii="Calibri" w:cs="Calibri" w:eastAsia="Calibri" w:hAnsi="Calibri"/>
+                <w:b/>
+                <w:bCs/>
+                <w:color w:val="1F2328"/>
+                <w:sz w:val="18"/>
+                <w:szCs w:val="18"/>
+              </w:rPr>
+              <w:t xml:space="preserve">Ronde 3</w:t>
+            </w:r>
+          </w:p>
+        </w:tc>
+        <w:tc>
+          <w:tcPr>
+            <w:tcW w:type="dxa" w:w="4000"/>
+            <w:tcBorders>
+              <w:top w:val="single" w:color="C9C4B5" w:sz="4"/>
+              <w:left w:val="single" w:color="C9C4B5" w:sz="4"/>
+              <w:bottom w:val="single" w:color="C9C4B5" w:sz="4"/>
+              <w:right w:val="single" w:color="C9C4B5" w:sz="4"/>
+            </w:tcBorders>
+            <w:tcMar>
+              <w:top w:type="dxa" w:w="60"/>
+              <w:left w:type="dxa" w:w="90"/>
+              <w:bottom w:type="dxa" w:w="60"/>
+              <w:right w:type="dxa" w:w="90"/>
+            </w:tcMar>
+            <w:vAlign w:val="top"/>
+          </w:tcPr>
+          <w:p>
+            <w:pPr>
+              <w:spacing w:after="40"/>
+            </w:pPr>
+            <w:r>
+              <w:rPr>
+                <w:rFonts w:ascii="Calibri" w:cs="Calibri" w:eastAsia="Calibri" w:hAnsi="Calibri"/>
+                <w:color w:val="1F2328"/>
+                <w:sz w:val="18"/>
+                <w:szCs w:val="18"/>
+              </w:rPr>
+              <w:t xml:space="preserve">februari tot en met toetsweek C</w:t>
+            </w:r>
+          </w:p>
+        </w:tc>
+        <w:tc>
+          <w:tcPr>
+            <w:tcW w:type="dxa" w:w="8198"/>
+            <w:tcBorders>
+              <w:top w:val="single" w:color="C9C4B5" w:sz="4"/>
+              <w:left w:val="single" w:color="C9C4B5" w:sz="4"/>
+              <w:bottom w:val="single" w:color="C9C4B5" w:sz="4"/>
+              <w:right w:val="single" w:color="C9C4B5" w:sz="4"/>
+            </w:tcBorders>
+            <w:tcMar>
+              <w:top w:type="dxa" w:w="60"/>
+              <w:left w:type="dxa" w:w="90"/>
+              <w:bottom w:type="dxa" w:w="60"/>
+              <w:right w:type="dxa" w:w="90"/>
+            </w:tcMar>
+            <w:vAlign w:val="top"/>
+          </w:tcPr>
+          <w:p>
+            <w:pPr>
+              <w:spacing w:after="40"/>
+            </w:pPr>
+            <w:r>
+              <w:rPr>
+                <w:rFonts w:ascii="Calibri" w:cs="Calibri" w:eastAsia="Calibri" w:hAnsi="Calibri"/>
+                <w:color w:val="1F2328"/>
+                <w:sz w:val="18"/>
+                <w:szCs w:val="18"/>
+              </w:rPr>
+              <w:t xml:space="preserve">Een derde nieuwe manier.</w:t>
+            </w:r>
+          </w:p>
+        </w:tc>
+      </w:tr>
+      <w:tr>
+        <w:tc>
+          <w:tcPr>
+            <w:tcW w:type="dxa" w:w="3200"/>
+            <w:tcBorders>
+              <w:top w:val="single" w:color="C9C4B5" w:sz="4"/>
+              <w:left w:val="single" w:color="C9C4B5" w:sz="4"/>
+              <w:bottom w:val="single" w:color="C9C4B5" w:sz="4"/>
+              <w:right w:val="single" w:color="C9C4B5" w:sz="4"/>
+            </w:tcBorders>
+            <w:shd w:fill="F8EFD2" w:color="auto" w:val="clear"/>
+            <w:tcMar>
+              <w:top w:type="dxa" w:w="60"/>
+              <w:left w:type="dxa" w:w="90"/>
+              <w:bottom w:type="dxa" w:w="60"/>
+              <w:right w:type="dxa" w:w="90"/>
+            </w:tcMar>
+            <w:vAlign w:val="top"/>
+          </w:tcPr>
+          <w:p>
+            <w:pPr>
+              <w:spacing w:after="40"/>
+            </w:pPr>
+            <w:r>
+              <w:rPr>
+                <w:rFonts w:ascii="Calibri" w:cs="Calibri" w:eastAsia="Calibri" w:hAnsi="Calibri"/>
+                <w:b/>
+                <w:bCs/>
+                <w:color w:val="1F2328"/>
+                <w:sz w:val="18"/>
+                <w:szCs w:val="18"/>
+              </w:rPr>
+              <w:t xml:space="preserve">Mijn keuze</w:t>
+            </w:r>
+          </w:p>
+        </w:tc>
+        <w:tc>
+          <w:tcPr>
+            <w:tcW w:type="dxa" w:w="4000"/>
+            <w:tcBorders>
+              <w:top w:val="single" w:color="C9C4B5" w:sz="4"/>
+              <w:left w:val="single" w:color="C9C4B5" w:sz="4"/>
+              <w:bottom w:val="single" w:color="C9C4B5" w:sz="4"/>
+              <w:right w:val="single" w:color="C9C4B5" w:sz="4"/>
+            </w:tcBorders>
+            <w:tcMar>
+              <w:top w:type="dxa" w:w="60"/>
+              <w:left w:type="dxa" w:w="90"/>
+              <w:bottom w:type="dxa" w:w="60"/>
+              <w:right w:type="dxa" w:w="90"/>
+            </w:tcMar>
+            <w:vAlign w:val="top"/>
+          </w:tcPr>
+          <w:p>
+            <w:pPr>
+              <w:spacing w:after="40"/>
+            </w:pPr>
+            <w:r>
+              <w:rPr>
+                <w:rFonts w:ascii="Calibri" w:cs="Calibri" w:eastAsia="Calibri" w:hAnsi="Calibri"/>
+                <w:color w:val="1F2328"/>
+                <w:sz w:val="18"/>
+                <w:szCs w:val="18"/>
+              </w:rPr>
+              <w:t xml:space="preserve">vóór de meivakantie</w:t>
+            </w:r>
+          </w:p>
+        </w:tc>
+        <w:tc>
+          <w:tcPr>
+            <w:tcW w:type="dxa" w:w="8198"/>
+            <w:tcBorders>
+              <w:top w:val="single" w:color="C9C4B5" w:sz="4"/>
+              <w:left w:val="single" w:color="C9C4B5" w:sz="4"/>
+              <w:bottom w:val="single" w:color="C9C4B5" w:sz="4"/>
+              <w:right w:val="single" w:color="C9C4B5" w:sz="4"/>
+            </w:tcBorders>
+            <w:tcMar>
+              <w:top w:type="dxa" w:w="60"/>
+              <w:left w:type="dxa" w:w="90"/>
+              <w:bottom w:type="dxa" w:w="60"/>
+              <w:right w:type="dxa" w:w="90"/>
+            </w:tcMar>
+            <w:vAlign w:val="top"/>
+          </w:tcPr>
+          <w:p>
+            <w:pPr>
+              <w:spacing w:after="40"/>
+            </w:pPr>
+            <w:r>
+              <w:rPr>
+                <w:rFonts w:ascii="Calibri" w:cs="Calibri" w:eastAsia="Calibri" w:hAnsi="Calibri"/>
+                <w:color w:val="1F2328"/>
+                <w:sz w:val="18"/>
+                <w:szCs w:val="18"/>
+              </w:rPr>
+              <w:t xml:space="preserve">Kies de manier die je blijft gebruiken, en laat met bewijs zien waarom.</w:t>
             </w:r>
           </w:p>
         </w:tc>
@@ -2311,7 +2942,7 @@
                 <w:sz w:val="18"/>
                 <w:szCs w:val="18"/>
               </w:rPr>
-              <w:t xml:space="preserve"> · Doelen aanscherpen in duo’s, actieplan afronden, PDF maken en inleveren.</w:t>
+              <w:t xml:space="preserve"> · Doelen aanscherpen in duo’s, actieplan afronden. MOL-gesprek 1 voorbereiden (spiekkaart) en thuis laten zien. PDF maken en inleveren.</w:t>
             </w:r>
           </w:p>
         </w:tc>
@@ -2354,7 +2985,7 @@
                 <w:sz w:val="18"/>
                 <w:szCs w:val="18"/>
               </w:rPr>
-              <w:t xml:space="preserve"> · Actieplan afronden (stap 3 tot en met 5), PDF maken en inleveren.</w:t>
+              <w:t xml:space="preserve"> · Actieplan afronden (stap 3 tot en met 5). MOL-gesprek 1 voorbereiden (spiekkaart) en thuis laten zien. PDF maken en inleveren.</w:t>
             </w:r>
           </w:p>
         </w:tc>
@@ -2502,7 +3133,7 @@
                 <w:sz w:val="18"/>
                 <w:szCs w:val="18"/>
               </w:rPr>
-              <w:t xml:space="preserve"> · MOL-afspraken invullen in de tool. LOB deel 1: interessetest.</w:t>
+              <w:t xml:space="preserve"> · Na het MOL-gesprek: afspraken invullen en terugkijken. LOB deel 1: interessetest.</w:t>
             </w:r>
           </w:p>
         </w:tc>
@@ -2546,7 +3177,7 @@
                 <w:sz w:val="18"/>
                 <w:szCs w:val="18"/>
               </w:rPr>
-              <w:t xml:space="preserve"> · MOL-afspraken invullen. LOB deel 1: interessetest.</w:t>
+              <w:t xml:space="preserve"> · Na het MOL-gesprek: afspraken invullen en terugkijken. LOB deel 1: interessetest.</w:t>
             </w:r>
           </w:p>
         </w:tc>
@@ -5856,7 +6487,7 @@
                 <w:sz w:val="18"/>
                 <w:szCs w:val="18"/>
               </w:rPr>
-              <w:t xml:space="preserve"> · Tussenbalans maken en PDF inleveren.</w:t>
+              <w:t xml:space="preserve"> · Tussenbalans maken. MOL-gesprek 2 voorbereiden (spiekkaart) en thuis laten zien. PDF inleveren.</w:t>
             </w:r>
           </w:p>
         </w:tc>
@@ -5899,7 +6530,7 @@
                 <w:sz w:val="18"/>
                 <w:szCs w:val="18"/>
               </w:rPr>
-              <w:t xml:space="preserve"> · Tussenbalans maken en PDF inleveren.</w:t>
+              <w:t xml:space="preserve"> · Tussenbalans maken. MOL-gesprek 2 voorbereiden (spiekkaart) en thuis laten zien. PDF inleveren.</w:t>
             </w:r>
           </w:p>
         </w:tc>
@@ -6061,7 +6692,7 @@
                 <w:sz w:val="18"/>
                 <w:szCs w:val="18"/>
               </w:rPr>
-              <w:t xml:space="preserve"> · MOL-afspraken invullen. LOB deel 2: interview afspreken en voorbereiden.</w:t>
+              <w:t xml:space="preserve"> · Na het MOL-gesprek: afspraken invullen en terugkijken. LOB deel 2: interview afspreken en voorbereiden.</w:t>
             </w:r>
           </w:p>
         </w:tc>
@@ -6105,7 +6736,7 @@
                 <w:sz w:val="18"/>
                 <w:szCs w:val="18"/>
               </w:rPr>
-              <w:t xml:space="preserve"> · MOL-afspraken invullen. Interviewvragen maken.</w:t>
+              <w:t xml:space="preserve"> · Na het MOL-gesprek: afspraken invullen en terugkijken. Interviewvragen maken.</w:t>
             </w:r>
           </w:p>
         </w:tc>
@@ -6749,7 +7380,7 @@
                 <w:sz w:val="18"/>
                 <w:szCs w:val="18"/>
               </w:rPr>
-              <w:t xml:space="preserve"> · Toetsweekplan C afronden met doelcheck en overgang. LOB 2-reflectie.</w:t>
+              <w:t xml:space="preserve"> · Toetsweekplan C afronden met doelcheck en overgang. LOB 2-reflectie. MOL-gesprek 3 voorbereiden en thuis laten zien.</w:t>
             </w:r>
           </w:p>
         </w:tc>
@@ -6792,7 +7423,7 @@
                 <w:sz w:val="18"/>
                 <w:szCs w:val="18"/>
               </w:rPr>
-              <w:t xml:space="preserve"> · Toetsweekplan C afronden met doelcheck en overgang. LOB deel 2 inleveren, LOB 2-reflectie.</w:t>
+              <w:t xml:space="preserve"> · Toetsweekplan C afronden met doelcheck en overgang. LOB deel 2 inleveren, LOB 2-reflectie. MOL-gesprek 3 voorbereiden en thuis laten zien.</w:t>
             </w:r>
           </w:p>
         </w:tc>
@@ -7269,7 +7900,7 @@
                 <w:sz w:val="18"/>
                 <w:szCs w:val="18"/>
               </w:rPr>
-              <w:t xml:space="preserve"> · MOL-afspraken invullen. Terugblik toetsweek C: organisatie.</w:t>
+              <w:t xml:space="preserve"> · Na het MOL-gesprek: afspraken invullen en terugkijken. Terugblik toetsweek C: organisatie.</w:t>
             </w:r>
           </w:p>
         </w:tc>
@@ -7313,7 +7944,7 @@
                 <w:sz w:val="18"/>
                 <w:szCs w:val="18"/>
               </w:rPr>
-              <w:t xml:space="preserve"> · MOL-afspraken invullen. Uitleg eindpitch.</w:t>
+              <w:t xml:space="preserve"> · Na het MOL-gesprek: afspraken invullen en terugkijken. Uitleg eindpitch.</w:t>
             </w:r>
           </w:p>
         </w:tc>

</xml_diff>

<commit_message>
Feedback docent en klasgenoot, SLO-functies, uitlegpaneel
Co-Authored-By: Claude Opus 5 <noreply@anthropic.com>
Claude-Session: https://claude.ai/code/session_01ANGbdbaxhJNxHHij1urWpj
</commit_message>
<xml_diff>
--- a/Jaarplanner_leerlingen_H4E_2026-2027.docx
+++ b/Jaarplanner_leerlingen_H4E_2026-2027.docx
@@ -1320,6 +1320,74 @@
                 <w:sz w:val="18"/>
                 <w:szCs w:val="18"/>
               </w:rPr>
+              <w:t xml:space="preserve">week 47 – 49 en week 9 – 10</w:t>
+            </w:r>
+          </w:p>
+        </w:tc>
+        <w:tc>
+          <w:tcPr>
+            <w:tcW w:type="dxa" w:w="11398"/>
+            <w:tcBorders>
+              <w:top w:val="single" w:color="C9C4B5" w:sz="4"/>
+              <w:left w:val="single" w:color="C9C4B5" w:sz="4"/>
+              <w:bottom w:val="single" w:color="C9C4B5" w:sz="4"/>
+              <w:right w:val="single" w:color="C9C4B5" w:sz="4"/>
+            </w:tcBorders>
+            <w:tcMar>
+              <w:top w:type="dxa" w:w="60"/>
+              <w:left w:type="dxa" w:w="90"/>
+              <w:bottom w:type="dxa" w:w="60"/>
+              <w:right w:type="dxa" w:w="90"/>
+            </w:tcMar>
+            <w:vAlign w:val="top"/>
+          </w:tcPr>
+          <w:p>
+            <w:pPr>
+              <w:spacing w:after="40"/>
+            </w:pPr>
+            <w:r>
+              <w:rPr>
+                <w:rFonts w:ascii="Calibri" w:cs="Calibri" w:eastAsia="Calibri" w:hAnsi="Calibri"/>
+                <w:color w:val="1F2328"/>
+                <w:sz w:val="18"/>
+                <w:szCs w:val="18"/>
+              </w:rPr>
+              <w:t xml:space="preserve">Feedback van een docent: kies één docent, kondig het een week vooraf aan en schrijf op wat je ermee doet</w:t>
+            </w:r>
+          </w:p>
+        </w:tc>
+      </w:tr>
+      <w:tr>
+        <w:tc>
+          <w:tcPr>
+            <w:tcW w:type="dxa" w:w="4000"/>
+            <w:tcBorders>
+              <w:top w:val="single" w:color="C9C4B5" w:sz="4"/>
+              <w:left w:val="single" w:color="C9C4B5" w:sz="4"/>
+              <w:bottom w:val="single" w:color="C9C4B5" w:sz="4"/>
+              <w:right w:val="single" w:color="C9C4B5" w:sz="4"/>
+            </w:tcBorders>
+            <w:tcMar>
+              <w:top w:type="dxa" w:w="60"/>
+              <w:left w:type="dxa" w:w="90"/>
+              <w:bottom w:type="dxa" w:w="60"/>
+              <w:right w:type="dxa" w:w="90"/>
+            </w:tcMar>
+            <w:vAlign w:val="top"/>
+          </w:tcPr>
+          <w:p>
+            <w:pPr>
+              <w:spacing w:after="40"/>
+            </w:pPr>
+            <w:r>
+              <w:rPr>
+                <w:rFonts w:ascii="Calibri" w:cs="Calibri" w:eastAsia="Calibri" w:hAnsi="Calibri"/>
+                <w:b/>
+                <w:bCs/>
+                <w:color w:val="1F2328"/>
+                <w:sz w:val="18"/>
+                <w:szCs w:val="18"/>
+              </w:rPr>
               <w:t xml:space="preserve">vr 4 dec</w:t>
             </w:r>
           </w:p>
@@ -1719,7 +1787,7 @@
                 <w:sz w:val="18"/>
                 <w:szCs w:val="18"/>
               </w:rPr>
-              <w:t xml:space="preserve">Nulmeting</w:t>
+              <w:t xml:space="preserve">Nulmeting (verplicht)</w:t>
             </w:r>
           </w:p>
         </w:tc>
@@ -1820,7 +1888,7 @@
                 <w:sz w:val="18"/>
                 <w:szCs w:val="18"/>
               </w:rPr>
-              <w:t xml:space="preserve">Ronde 1</w:t>
+              <w:t xml:space="preserve">Ronde 1 (keuze)</w:t>
             </w:r>
           </w:p>
         </w:tc>
@@ -1884,7 +1952,7 @@
                 <w:sz w:val="18"/>
                 <w:szCs w:val="18"/>
               </w:rPr>
-              <w:t xml:space="preserve">Kies een nieuwe manier van leren, oefen ermee, houd een logboek bij en beschrijf hoe het ging.</w:t>
+              <w:t xml:space="preserve">Kies een nieuwe manier van leren (je mentor moet akkoord zijn), oefen ermee, houd een logboek bij en beschrijf hoe het ging.</w:t>
             </w:r>
           </w:p>
         </w:tc>
@@ -1921,7 +1989,7 @@
                 <w:sz w:val="18"/>
                 <w:szCs w:val="18"/>
               </w:rPr>
-              <w:t xml:space="preserve">Ronde 2</w:t>
+              <w:t xml:space="preserve">Ronde 2 (keuze)</w:t>
             </w:r>
           </w:p>
         </w:tc>
@@ -2022,7 +2090,7 @@
                 <w:sz w:val="18"/>
                 <w:szCs w:val="18"/>
               </w:rPr>
-              <w:t xml:space="preserve">Ronde 3</w:t>
+              <w:t xml:space="preserve">Ronde 3 (keuze)</w:t>
             </w:r>
           </w:p>
         </w:tc>
@@ -2123,7 +2191,7 @@
                 <w:sz w:val="18"/>
                 <w:szCs w:val="18"/>
               </w:rPr>
-              <w:t xml:space="preserve">Mijn keuze</w:t>
+              <w:t xml:space="preserve">Mijn keuze (verplicht)</w:t>
             </w:r>
           </w:p>
         </w:tc>
@@ -4354,7 +4422,7 @@
                 <w:sz w:val="18"/>
                 <w:szCs w:val="18"/>
               </w:rPr>
-              <w:t xml:space="preserve"> · Cijfers invullen in je terugblik, check op je doelen afmaken.</w:t>
+              <w:t xml:space="preserve"> · Cijfers invullen in je terugblik, check op je doelen afmaken. Kies een docent voor feedback en kondig het aan.</w:t>
             </w:r>
           </w:p>
         </w:tc>
@@ -4398,7 +4466,7 @@
                 <w:sz w:val="18"/>
                 <w:szCs w:val="18"/>
               </w:rPr>
-              <w:t xml:space="preserve"> · Terugblik toetsweek A en check op je doelen.</w:t>
+              <w:t xml:space="preserve"> · Terugblik toetsweek A en check op je doelen. Kies een docent voor feedback en kondig het aan.</w:t>
             </w:r>
           </w:p>
         </w:tc>
@@ -4793,7 +4861,7 @@
                 <w:sz w:val="18"/>
                 <w:szCs w:val="18"/>
               </w:rPr>
-              <w:t xml:space="preserve"> · LOB deel 1 inleveren in Magister. LOB 1-reflectie in de tool.</w:t>
+              <w:t xml:space="preserve"> · LOB deel 1 inleveren in Magister. LOB 1-reflectie in de tool. Feedback van je docent verwerken.</w:t>
             </w:r>
           </w:p>
         </w:tc>
@@ -4837,7 +4905,7 @@
                 <w:sz w:val="18"/>
                 <w:szCs w:val="18"/>
               </w:rPr>
-              <w:t xml:space="preserve"> · LOB deel 1 afronden en inleveren. LOB 1-reflectie in de tool.</w:t>
+              <w:t xml:space="preserve"> · LOB deel 1 afronden en inleveren. LOB 1-reflectie in de tool. Feedback van je docent verwerken.</w:t>
             </w:r>
           </w:p>
         </w:tc>
@@ -7013,7 +7081,7 @@
                 <w:sz w:val="18"/>
                 <w:szCs w:val="18"/>
               </w:rPr>
-              <w:t xml:space="preserve"> · LOB deel 2 bijwerken. Toetsweekplan C starten.</w:t>
+              <w:t xml:space="preserve"> · LOB deel 2 bijwerken. Toetsweekplan C starten. Kies een docent voor feedback en kondig het aan.</w:t>
             </w:r>
           </w:p>
         </w:tc>
@@ -7056,7 +7124,7 @@
                 <w:sz w:val="18"/>
                 <w:szCs w:val="18"/>
               </w:rPr>
-              <w:t xml:space="preserve"> · LOB deel 2: vergelijking opleidingen en drie beroepen.</w:t>
+              <w:t xml:space="preserve"> · LOB deel 2: vergelijking opleidingen en drie beroepen. Kies een docent voor feedback en kondig het aan.</w:t>
             </w:r>
           </w:p>
         </w:tc>
@@ -7189,7 +7257,7 @@
                 <w:sz w:val="18"/>
                 <w:szCs w:val="18"/>
               </w:rPr>
-              <w:t xml:space="preserve"> · Toetsweekplan C maken. LOB deel 2 afronden.</w:t>
+              <w:t xml:space="preserve"> · Toetsweekplan C maken. LOB deel 2 afronden. Feedback van je docent verwerken.</w:t>
             </w:r>
           </w:p>
         </w:tc>
@@ -7233,7 +7301,7 @@
                 <w:sz w:val="18"/>
                 <w:szCs w:val="18"/>
               </w:rPr>
-              <w:t xml:space="preserve"> · LOB deel 2 bijwerken. Toetsweekplan C starten.</w:t>
+              <w:t xml:space="preserve"> · LOB deel 2 bijwerken. Toetsweekplan C starten. Feedback van je docent verwerken.</w:t>
             </w:r>
           </w:p>
         </w:tc>

</xml_diff>

<commit_message>
Basis en extras via klaslink, Deze week voor leerling en mentor
Co-Authored-By: Claude Opus 5 <noreply@anthropic.com>
Claude-Session: https://claude.ai/code/session_01ANGbdbaxhJNxHHij1urWpj
</commit_message>
<xml_diff>
--- a/Jaarplanner_leerlingen_H4E_2026-2027.docx
+++ b/Jaarplanner_leerlingen_H4E_2026-2027.docx
@@ -4422,7 +4422,7 @@
                 <w:sz w:val="18"/>
                 <w:szCs w:val="18"/>
               </w:rPr>
-              <w:t xml:space="preserve"> · Cijfers invullen in je terugblik, check op je doelen afmaken. Kies een docent voor feedback en kondig het aan.</w:t>
+              <w:t xml:space="preserve"> · Cijfers invullen in je terugblik, check op je doelen afmaken. Extra: kies een docent voor feedback en kondig het aan.</w:t>
             </w:r>
           </w:p>
         </w:tc>
@@ -4466,7 +4466,7 @@
                 <w:sz w:val="18"/>
                 <w:szCs w:val="18"/>
               </w:rPr>
-              <w:t xml:space="preserve"> · Terugblik toetsweek A en check op je doelen. Kies een docent voor feedback en kondig het aan.</w:t>
+              <w:t xml:space="preserve"> · Terugblik toetsweek A en check op je doelen. Extra: kies een docent voor feedback en kondig het aan.</w:t>
             </w:r>
           </w:p>
         </w:tc>
@@ -4861,7 +4861,7 @@
                 <w:sz w:val="18"/>
                 <w:szCs w:val="18"/>
               </w:rPr>
-              <w:t xml:space="preserve"> · LOB deel 1 inleveren in Magister. LOB 1-reflectie in de tool. Feedback van je docent verwerken.</w:t>
+              <w:t xml:space="preserve"> · LOB deel 1 inleveren in Magister. LOB 1-reflectie in de tool. Extra: feedback van je docent verwerken.</w:t>
             </w:r>
           </w:p>
         </w:tc>
@@ -4905,7 +4905,7 @@
                 <w:sz w:val="18"/>
                 <w:szCs w:val="18"/>
               </w:rPr>
-              <w:t xml:space="preserve"> · LOB deel 1 afronden en inleveren. LOB 1-reflectie in de tool. Feedback van je docent verwerken.</w:t>
+              <w:t xml:space="preserve"> · LOB deel 1 afronden en inleveren. LOB 1-reflectie in de tool. Extra: feedback van je docent verwerken.</w:t>
             </w:r>
           </w:p>
         </w:tc>
@@ -7081,7 +7081,7 @@
                 <w:sz w:val="18"/>
                 <w:szCs w:val="18"/>
               </w:rPr>
-              <w:t xml:space="preserve"> · LOB deel 2 bijwerken. Toetsweekplan C starten. Kies een docent voor feedback en kondig het aan.</w:t>
+              <w:t xml:space="preserve"> · LOB deel 2 bijwerken. Toetsweekplan C starten. Extra: kies een docent voor feedback en kondig het aan.</w:t>
             </w:r>
           </w:p>
         </w:tc>
@@ -7124,7 +7124,7 @@
                 <w:sz w:val="18"/>
                 <w:szCs w:val="18"/>
               </w:rPr>
-              <w:t xml:space="preserve"> · LOB deel 2: vergelijking opleidingen en drie beroepen. Kies een docent voor feedback en kondig het aan.</w:t>
+              <w:t xml:space="preserve"> · LOB deel 2: vergelijking opleidingen en drie beroepen. Extra: kies een docent voor feedback en kondig het aan.</w:t>
             </w:r>
           </w:p>
         </w:tc>
@@ -7257,7 +7257,7 @@
                 <w:sz w:val="18"/>
                 <w:szCs w:val="18"/>
               </w:rPr>
-              <w:t xml:space="preserve"> · Toetsweekplan C maken. LOB deel 2 afronden. Feedback van je docent verwerken.</w:t>
+              <w:t xml:space="preserve"> · Toetsweekplan C maken. LOB deel 2 afronden. Extra: feedback van je docent verwerken.</w:t>
             </w:r>
           </w:p>
         </w:tc>
@@ -7301,7 +7301,7 @@
                 <w:sz w:val="18"/>
                 <w:szCs w:val="18"/>
               </w:rPr>
-              <w:t xml:space="preserve"> · LOB deel 2 bijwerken. Toetsweekplan C starten. Feedback van je docent verwerken.</w:t>
+              <w:t xml:space="preserve"> · LOB deel 2 bijwerken. Toetsweekplan C starten. Extra: feedback van je docent verwerken.</w:t>
             </w:r>
           </w:p>
         </w:tc>

</xml_diff>

<commit_message>
Mentorportaal in vijf tabs, stappenplannen en jaarplaat
Co-Authored-By: Claude Opus 5 <noreply@anthropic.com>
Claude-Session: https://claude.ai/code/session_01ANGbdbaxhJNxHHij1urWpj
</commit_message>
<xml_diff>
--- a/Jaarplanner_leerlingen_H4E_2026-2027.docx
+++ b/Jaarplanner_leerlingen_H4E_2026-2027.docx
@@ -150,6 +150,384 @@
         <w:rPr>
           <w:rFonts w:ascii="Calibri" w:cs="Calibri" w:eastAsia="Calibri" w:hAnsi="Calibri"/>
         </w:rPr>
+        <w:t xml:space="preserve">Zo werkt elke week</w:t>
+      </w:r>
+    </w:p>
+    <w:tbl>
+      <w:tblPr>
+        <w:tblW w:type="dxa" w:w="15395"/>
+        <w:tblBorders>
+          <w:top w:val="single" w:color="auto" w:sz="4"/>
+          <w:left w:val="single" w:color="auto" w:sz="4"/>
+          <w:bottom w:val="single" w:color="auto" w:sz="4"/>
+          <w:right w:val="single" w:color="auto" w:sz="4"/>
+          <w:insideH w:val="single" w:color="auto" w:sz="4"/>
+          <w:insideV w:val="single" w:color="auto" w:sz="4"/>
+        </w:tblBorders>
+      </w:tblPr>
+      <w:tblGrid>
+        <w:gridCol w:w="3079"/>
+        <w:gridCol w:w="3079"/>
+        <w:gridCol w:w="3079"/>
+        <w:gridCol w:w="3079"/>
+        <w:gridCol w:w="3079"/>
+      </w:tblGrid>
+      <w:tr>
+        <w:trPr>
+          <w:cantSplit/>
+        </w:trPr>
+        <w:tc>
+          <w:tcPr>
+            <w:tcW w:type="dxa" w:w="3079"/>
+            <w:tcBorders>
+              <w:top w:val="single" w:color="C9C4B5" w:sz="4"/>
+              <w:left w:val="single" w:color="C9C4B5" w:sz="4"/>
+              <w:bottom w:val="single" w:color="C9C4B5" w:sz="4"/>
+              <w:right w:val="single" w:color="C9C4B5" w:sz="4"/>
+            </w:tcBorders>
+            <w:shd w:fill="0A58A3" w:color="auto" w:val="clear"/>
+            <w:tcMar>
+              <w:top w:type="dxa" w:w="60"/>
+              <w:left w:type="dxa" w:w="90"/>
+              <w:bottom w:type="dxa" w:w="60"/>
+              <w:right w:type="dxa" w:w="90"/>
+            </w:tcMar>
+            <w:vAlign w:val="top"/>
+          </w:tcPr>
+          <w:p>
+            <w:pPr>
+              <w:spacing w:after="40"/>
+            </w:pPr>
+            <w:r>
+              <w:rPr>
+                <w:rFonts w:ascii="Calibri" w:cs="Calibri" w:eastAsia="Calibri" w:hAnsi="Calibri"/>
+                <w:b/>
+                <w:bCs/>
+                <w:color w:val="FFFFFF"/>
+                <w:sz w:val="22"/>
+                <w:szCs w:val="22"/>
+              </w:rPr>
+              <w:t xml:space="preserve">1. Open Deze week</w:t>
+            </w:r>
+          </w:p>
+        </w:tc>
+        <w:tc>
+          <w:tcPr>
+            <w:tcW w:type="dxa" w:w="3079"/>
+            <w:tcBorders>
+              <w:top w:val="single" w:color="C9C4B5" w:sz="4"/>
+              <w:left w:val="single" w:color="C9C4B5" w:sz="4"/>
+              <w:bottom w:val="single" w:color="C9C4B5" w:sz="4"/>
+              <w:right w:val="single" w:color="C9C4B5" w:sz="4"/>
+            </w:tcBorders>
+            <w:shd w:fill="0A58A3" w:color="auto" w:val="clear"/>
+            <w:tcMar>
+              <w:top w:type="dxa" w:w="60"/>
+              <w:left w:type="dxa" w:w="90"/>
+              <w:bottom w:type="dxa" w:w="60"/>
+              <w:right w:type="dxa" w:w="90"/>
+            </w:tcMar>
+            <w:vAlign w:val="top"/>
+          </w:tcPr>
+          <w:p>
+            <w:pPr>
+              <w:spacing w:after="40"/>
+            </w:pPr>
+            <w:r>
+              <w:rPr>
+                <w:rFonts w:ascii="Calibri" w:cs="Calibri" w:eastAsia="Calibri" w:hAnsi="Calibri"/>
+                <w:b/>
+                <w:bCs/>
+                <w:color w:val="FFFFFF"/>
+                <w:sz w:val="22"/>
+                <w:szCs w:val="22"/>
+              </w:rPr>
+              <w:t xml:space="preserve">2. Kijk terug</w:t>
+            </w:r>
+          </w:p>
+        </w:tc>
+        <w:tc>
+          <w:tcPr>
+            <w:tcW w:type="dxa" w:w="3079"/>
+            <w:tcBorders>
+              <w:top w:val="single" w:color="C9C4B5" w:sz="4"/>
+              <w:left w:val="single" w:color="C9C4B5" w:sz="4"/>
+              <w:bottom w:val="single" w:color="C9C4B5" w:sz="4"/>
+              <w:right w:val="single" w:color="C9C4B5" w:sz="4"/>
+            </w:tcBorders>
+            <w:shd w:fill="0A58A3" w:color="auto" w:val="clear"/>
+            <w:tcMar>
+              <w:top w:type="dxa" w:w="60"/>
+              <w:left w:type="dxa" w:w="90"/>
+              <w:bottom w:type="dxa" w:w="60"/>
+              <w:right w:type="dxa" w:w="90"/>
+            </w:tcMar>
+            <w:vAlign w:val="top"/>
+          </w:tcPr>
+          <w:p>
+            <w:pPr>
+              <w:spacing w:after="40"/>
+            </w:pPr>
+            <w:r>
+              <w:rPr>
+                <w:rFonts w:ascii="Calibri" w:cs="Calibri" w:eastAsia="Calibri" w:hAnsi="Calibri"/>
+                <w:b/>
+                <w:bCs/>
+                <w:color w:val="FFFFFF"/>
+                <w:sz w:val="22"/>
+                <w:szCs w:val="22"/>
+              </w:rPr>
+              <w:t xml:space="preserve">3. Doe de opdracht</w:t>
+            </w:r>
+          </w:p>
+        </w:tc>
+        <w:tc>
+          <w:tcPr>
+            <w:tcW w:type="dxa" w:w="3079"/>
+            <w:tcBorders>
+              <w:top w:val="single" w:color="C9C4B5" w:sz="4"/>
+              <w:left w:val="single" w:color="C9C4B5" w:sz="4"/>
+              <w:bottom w:val="single" w:color="C9C4B5" w:sz="4"/>
+              <w:right w:val="single" w:color="C9C4B5" w:sz="4"/>
+            </w:tcBorders>
+            <w:shd w:fill="0A58A3" w:color="auto" w:val="clear"/>
+            <w:tcMar>
+              <w:top w:type="dxa" w:w="60"/>
+              <w:left w:type="dxa" w:w="90"/>
+              <w:bottom w:type="dxa" w:w="60"/>
+              <w:right w:type="dxa" w:w="90"/>
+            </w:tcMar>
+            <w:vAlign w:val="top"/>
+          </w:tcPr>
+          <w:p>
+            <w:pPr>
+              <w:spacing w:after="40"/>
+            </w:pPr>
+            <w:r>
+              <w:rPr>
+                <w:rFonts w:ascii="Calibri" w:cs="Calibri" w:eastAsia="Calibri" w:hAnsi="Calibri"/>
+                <w:b/>
+                <w:bCs/>
+                <w:color w:val="FFFFFF"/>
+                <w:sz w:val="22"/>
+                <w:szCs w:val="22"/>
+              </w:rPr>
+              <w:t xml:space="preserve">4. Sluit af</w:t>
+            </w:r>
+          </w:p>
+        </w:tc>
+        <w:tc>
+          <w:tcPr>
+            <w:tcW w:type="dxa" w:w="3079"/>
+            <w:tcBorders>
+              <w:top w:val="single" w:color="C9C4B5" w:sz="4"/>
+              <w:left w:val="single" w:color="C9C4B5" w:sz="4"/>
+              <w:bottom w:val="single" w:color="C9C4B5" w:sz="4"/>
+              <w:right w:val="single" w:color="C9C4B5" w:sz="4"/>
+            </w:tcBorders>
+            <w:shd w:fill="0A58A3" w:color="auto" w:val="clear"/>
+            <w:tcMar>
+              <w:top w:type="dxa" w:w="60"/>
+              <w:left w:type="dxa" w:w="90"/>
+              <w:bottom w:type="dxa" w:w="60"/>
+              <w:right w:type="dxa" w:w="90"/>
+            </w:tcMar>
+            <w:vAlign w:val="top"/>
+          </w:tcPr>
+          <w:p>
+            <w:pPr>
+              <w:spacing w:after="40"/>
+            </w:pPr>
+            <w:r>
+              <w:rPr>
+                <w:rFonts w:ascii="Calibri" w:cs="Calibri" w:eastAsia="Calibri" w:hAnsi="Calibri"/>
+                <w:b/>
+                <w:bCs/>
+                <w:color w:val="FFFFFF"/>
+                <w:sz w:val="22"/>
+                <w:szCs w:val="22"/>
+              </w:rPr>
+              <w:t xml:space="preserve">5. Lever in</w:t>
+            </w:r>
+          </w:p>
+        </w:tc>
+      </w:tr>
+      <w:tr>
+        <w:trPr>
+          <w:cantSplit/>
+        </w:trPr>
+        <w:tc>
+          <w:tcPr>
+            <w:tcW w:type="dxa" w:w="3079"/>
+            <w:tcBorders>
+              <w:top w:val="single" w:color="C9C4B5" w:sz="4"/>
+              <w:left w:val="single" w:color="C9C4B5" w:sz="4"/>
+              <w:bottom w:val="single" w:color="C9C4B5" w:sz="4"/>
+              <w:right w:val="single" w:color="C9C4B5" w:sz="4"/>
+            </w:tcBorders>
+            <w:tcMar>
+              <w:top w:type="dxa" w:w="60"/>
+              <w:left w:type="dxa" w:w="90"/>
+              <w:bottom w:type="dxa" w:w="60"/>
+              <w:right w:type="dxa" w:w="90"/>
+            </w:tcMar>
+            <w:vAlign w:val="top"/>
+          </w:tcPr>
+          <w:p>
+            <w:pPr>
+              <w:spacing w:after="40"/>
+            </w:pPr>
+            <w:r>
+              <w:rPr>
+                <w:rFonts w:ascii="Calibri" w:cs="Calibri" w:eastAsia="Calibri" w:hAnsi="Calibri"/>
+                <w:color w:val="1F2328"/>
+                <w:sz w:val="19"/>
+                <w:szCs w:val="19"/>
+              </w:rPr>
+              <w:t xml:space="preserve">Klik op ‘Open de les’.</w:t>
+            </w:r>
+          </w:p>
+        </w:tc>
+        <w:tc>
+          <w:tcPr>
+            <w:tcW w:type="dxa" w:w="3079"/>
+            <w:tcBorders>
+              <w:top w:val="single" w:color="C9C4B5" w:sz="4"/>
+              <w:left w:val="single" w:color="C9C4B5" w:sz="4"/>
+              <w:bottom w:val="single" w:color="C9C4B5" w:sz="4"/>
+              <w:right w:val="single" w:color="C9C4B5" w:sz="4"/>
+            </w:tcBorders>
+            <w:tcMar>
+              <w:top w:type="dxa" w:w="60"/>
+              <w:left w:type="dxa" w:w="90"/>
+              <w:bottom w:type="dxa" w:w="60"/>
+              <w:right w:type="dxa" w:w="90"/>
+            </w:tcMar>
+            <w:vAlign w:val="top"/>
+          </w:tcPr>
+          <w:p>
+            <w:pPr>
+              <w:spacing w:after="40"/>
+            </w:pPr>
+            <w:r>
+              <w:rPr>
+                <w:rFonts w:ascii="Calibri" w:cs="Calibri" w:eastAsia="Calibri" w:hAnsi="Calibri"/>
+                <w:color w:val="1F2328"/>
+                <w:sz w:val="19"/>
+                <w:szCs w:val="19"/>
+              </w:rPr>
+              <w:t xml:space="preserve">Is je volgende stap van vorige keer gelukt?</w:t>
+            </w:r>
+          </w:p>
+        </w:tc>
+        <w:tc>
+          <w:tcPr>
+            <w:tcW w:type="dxa" w:w="3079"/>
+            <w:tcBorders>
+              <w:top w:val="single" w:color="C9C4B5" w:sz="4"/>
+              <w:left w:val="single" w:color="C9C4B5" w:sz="4"/>
+              <w:bottom w:val="single" w:color="C9C4B5" w:sz="4"/>
+              <w:right w:val="single" w:color="C9C4B5" w:sz="4"/>
+            </w:tcBorders>
+            <w:tcMar>
+              <w:top w:type="dxa" w:w="60"/>
+              <w:left w:type="dxa" w:w="90"/>
+              <w:bottom w:type="dxa" w:w="60"/>
+              <w:right w:type="dxa" w:w="90"/>
+            </w:tcMar>
+            <w:vAlign w:val="top"/>
+          </w:tcPr>
+          <w:p>
+            <w:pPr>
+              <w:spacing w:after="40"/>
+            </w:pPr>
+            <w:r>
+              <w:rPr>
+                <w:rFonts w:ascii="Calibri" w:cs="Calibri" w:eastAsia="Calibri" w:hAnsi="Calibri"/>
+                <w:color w:val="1F2328"/>
+                <w:sz w:val="19"/>
+                <w:szCs w:val="19"/>
+              </w:rPr>
+              <w:t xml:space="preserve">Loop je vast? Klik op het vraagteken.</w:t>
+            </w:r>
+          </w:p>
+        </w:tc>
+        <w:tc>
+          <w:tcPr>
+            <w:tcW w:type="dxa" w:w="3079"/>
+            <w:tcBorders>
+              <w:top w:val="single" w:color="C9C4B5" w:sz="4"/>
+              <w:left w:val="single" w:color="C9C4B5" w:sz="4"/>
+              <w:bottom w:val="single" w:color="C9C4B5" w:sz="4"/>
+              <w:right w:val="single" w:color="C9C4B5" w:sz="4"/>
+            </w:tcBorders>
+            <w:tcMar>
+              <w:top w:type="dxa" w:w="60"/>
+              <w:left w:type="dxa" w:w="90"/>
+              <w:bottom w:type="dxa" w:w="60"/>
+              <w:right w:type="dxa" w:w="90"/>
+            </w:tcMar>
+            <w:vAlign w:val="top"/>
+          </w:tcPr>
+          <w:p>
+            <w:pPr>
+              <w:spacing w:after="40"/>
+            </w:pPr>
+            <w:r>
+              <w:rPr>
+                <w:rFonts w:ascii="Calibri" w:cs="Calibri" w:eastAsia="Calibri" w:hAnsi="Calibri"/>
+                <w:color w:val="1F2328"/>
+                <w:sz w:val="19"/>
+                <w:szCs w:val="19"/>
+              </w:rPr>
+              <w:t xml:space="preserve">Wat deed je, hoe ging het, wat is je volgende stap?</w:t>
+            </w:r>
+          </w:p>
+        </w:tc>
+        <w:tc>
+          <w:tcPr>
+            <w:tcW w:type="dxa" w:w="3079"/>
+            <w:tcBorders>
+              <w:top w:val="single" w:color="C9C4B5" w:sz="4"/>
+              <w:left w:val="single" w:color="C9C4B5" w:sz="4"/>
+              <w:bottom w:val="single" w:color="C9C4B5" w:sz="4"/>
+              <w:right w:val="single" w:color="C9C4B5" w:sz="4"/>
+            </w:tcBorders>
+            <w:tcMar>
+              <w:top w:type="dxa" w:w="60"/>
+              <w:left w:type="dxa" w:w="90"/>
+              <w:bottom w:type="dxa" w:w="60"/>
+              <w:right w:type="dxa" w:w="90"/>
+            </w:tcMar>
+            <w:vAlign w:val="top"/>
+          </w:tcPr>
+          <w:p>
+            <w:pPr>
+              <w:spacing w:after="40"/>
+            </w:pPr>
+            <w:r>
+              <w:rPr>
+                <w:rFonts w:ascii="Calibri" w:cs="Calibri" w:eastAsia="Calibri" w:hAnsi="Calibri"/>
+                <w:color w:val="1F2328"/>
+                <w:sz w:val="19"/>
+                <w:szCs w:val="19"/>
+              </w:rPr>
+              <w:t xml:space="preserve">PDF in Teams, back-up in OneDrive.</w:t>
+            </w:r>
+          </w:p>
+        </w:tc>
+      </w:tr>
+    </w:tbl>
+    <w:p>
+      <w:pPr>
+        <w:pStyle w:val="Heading2"/>
+        <w:keepNext/>
+        <w:spacing w:after="100" w:before="200"/>
+      </w:pPr>
+      <w:r>
+        <w:rPr>
+          <w:rFonts w:ascii="Calibri" w:cs="Calibri" w:eastAsia="Calibri" w:hAnsi="Calibri"/>
+        </w:rPr>
         <w:t xml:space="preserve">Belangrijke data</w:t>
       </w:r>
     </w:p>
@@ -1216,7 +1594,7 @@
                 <w:sz w:val="18"/>
                 <w:szCs w:val="18"/>
               </w:rPr>
-              <w:t xml:space="preserve">Voorbereiding MOL-gesprek in de tool: je spiekkaart. Laat hem thuis zien; je ouder of verzorger typt een korte reactie.</w:t>
+              <w:t xml:space="preserve">Voorbereiding MOL-gesprek in de tool: je spiekkaart. Laat hem thuis zien.</w:t>
             </w:r>
           </w:p>
         </w:tc>
@@ -1352,7 +1730,7 @@
                 <w:sz w:val="18"/>
                 <w:szCs w:val="18"/>
               </w:rPr>
-              <w:t xml:space="preserve">Feedback van een docent: kies één docent, kondig het een week vooraf aan en schrijf op wat je ermee doet</w:t>
+              <w:t xml:space="preserve">Als je mentor het gebruikt: feedback van een docent. Kies één docent, kondig het een week vooraf aan en schrijf op wat je ermee doet.</w:t>
             </w:r>
           </w:p>
         </w:tc>
@@ -4555,7 +4933,7 @@
                 <w:sz w:val="18"/>
                 <w:szCs w:val="18"/>
               </w:rPr>
-              <w:t xml:space="preserve">Gesprek met je mentor vóór les 9. Daarna kun je in de tool verder.</w:t>
+              <w:t xml:space="preserve">Als je mentor het gespreksslot gebruikt: gesprek met je mentor vóór les 9. Daarna kun je in de tool verder.</w:t>
             </w:r>
           </w:p>
         </w:tc>
@@ -6440,7 +6818,7 @@
                 <w:sz w:val="18"/>
                 <w:szCs w:val="18"/>
               </w:rPr>
-              <w:t xml:space="preserve">Gesprek met je mentor vóór les 17. Daarna kun je in de tool verder.</w:t>
+              <w:t xml:space="preserve">Als je mentor het gespreksslot gebruikt: gesprek met je mentor vóór les 17. Daarna kun je in de tool verder.</w:t>
             </w:r>
           </w:p>
         </w:tc>
@@ -8627,7 +9005,7 @@
                 <w:sz w:val="18"/>
                 <w:szCs w:val="18"/>
               </w:rPr>
-              <w:t xml:space="preserve">Gesprek met je mentor vóór les 25. Daarna kun je in de tool verder.</w:t>
+              <w:t xml:space="preserve">Als je mentor het gespreksslot gebruikt: gesprek met je mentor vóór les 25. Daarna kun je in de tool verder.</w:t>
             </w:r>
           </w:p>
         </w:tc>

</xml_diff>

<commit_message>
Jaarplanners: uitleg over data en lesdag
</commit_message>
<xml_diff>
--- a/Jaarplanner_leerlingen_H4E_2026-2027.docx
+++ b/Jaarplanner_leerlingen_H4E_2026-2027.docx
@@ -2655,6 +2655,20 @@
           <w:rFonts w:ascii="Calibri" w:cs="Calibri" w:eastAsia="Calibri" w:hAnsi="Calibri"/>
         </w:rPr>
         <w:t xml:space="preserve">Per week</w:t>
+      </w:r>
+    </w:p>
+    <w:p>
+      <w:pPr>
+        <w:spacing w:after="100" w:before="0" w:line="276"/>
+      </w:pPr>
+      <w:r>
+        <w:rPr>
+          <w:rFonts w:ascii="Calibri" w:cs="Calibri" w:eastAsia="Calibri" w:hAnsi="Calibri"/>
+          <w:color w:val="1F2328"/>
+          <w:sz w:val="20"/>
+          <w:szCs w:val="20"/>
+        </w:rPr>
+        <w:t xml:space="preserve">Verandert het rooster? Dan zie je de nieuwe datum in de tool bij je lessen.</w:t>
       </w:r>
     </w:p>
     <w:tbl>

</xml_diff>

<commit_message>
Review: inhoud, feiten en aansluiting bord-tool herzien
</commit_message>
<xml_diff>
--- a/Jaarplanner_leerlingen_H4E_2026-2027.docx
+++ b/Jaarplanner_leerlingen_H4E_2026-2027.docx
@@ -3065,7 +3065,7 @@
                 <w:sz w:val="18"/>
                 <w:szCs w:val="18"/>
               </w:rPr>
-              <w:t xml:space="preserve"> · LOB deel 1: reflectie op je profielkeuze (±300 woorden).</w:t>
+              <w:t xml:space="preserve"> · Tool openen via de klaslink, bij Start groep 2 en je vakken kiezen. LOB deel 1: reflectie op je profielkeuze (±300 woorden). PDF maken, back-up in OneDrive.</w:t>
             </w:r>
           </w:p>
         </w:tc>
@@ -3479,7 +3479,7 @@
                 <w:sz w:val="18"/>
                 <w:szCs w:val="18"/>
               </w:rPr>
-              <w:t xml:space="preserve">Actieplan-PDF inleveren (alle leerlingen)</w:t>
+              <w:t xml:space="preserve">Actieplan af, PDF van deze les inleveren</w:t>
             </w:r>
           </w:p>
         </w:tc>
@@ -3593,7 +3593,7 @@
                 <w:sz w:val="18"/>
                 <w:szCs w:val="18"/>
               </w:rPr>
-              <w:t xml:space="preserve"> · Na het MOL-gesprek: afspraken invullen en terugkijken. LOB deel 1: interessetest.</w:t>
+              <w:t xml:space="preserve"> · Gesprek gehad? Afspraken invullen en terugkijken. LOB deel 1: interessetest. Is je profielreflectie nog niet af? Schrijf die dan ook.</w:t>
             </w:r>
           </w:p>
         </w:tc>
@@ -3637,7 +3637,7 @@
                 <w:sz w:val="18"/>
                 <w:szCs w:val="18"/>
               </w:rPr>
-              <w:t xml:space="preserve"> · Na het MOL-gesprek: afspraken invullen en terugkijken. LOB deel 1: interessetest.</w:t>
+              <w:t xml:space="preserve"> · Gesprek gehad? Afspraken invullen en terugkijken. LOB deel 1: interessetest.</w:t>
             </w:r>
           </w:p>
         </w:tc>
@@ -4103,7 +4103,7 @@
                 <w:sz w:val="18"/>
                 <w:szCs w:val="18"/>
               </w:rPr>
-              <w:t xml:space="preserve"> · Kolom ‘vlak ervoor’ bijwerken. LOB deel 1: talententest.</w:t>
+              <w:t xml:space="preserve"> · Kolom ‘vlak ervoor’ bijwerken, vragen voor SKIA bedenken. LOB deel 1: talententest.</w:t>
             </w:r>
           </w:p>
         </w:tc>
@@ -4147,7 +4147,7 @@
                 <w:sz w:val="18"/>
                 <w:szCs w:val="18"/>
               </w:rPr>
-              <w:t xml:space="preserve"> · Kolom ‘vlak ervoor’ bijwerken, vragen voor SKIA bedenken.</w:t>
+              <w:t xml:space="preserve"> · Kolom ‘vlak ervoor’ bijwerken, vragen voor SKIA bedenken. LOB deel 1: talententest.</w:t>
             </w:r>
           </w:p>
         </w:tc>
@@ -4625,7 +4625,7 @@
                 <w:sz w:val="18"/>
                 <w:szCs w:val="18"/>
               </w:rPr>
-              <w:t xml:space="preserve"> · Terugblik toetsweek A en check op je doelen.</w:t>
+              <w:t xml:space="preserve"> · Terugblik toetsweek A en check op je doelen. Wil je toetsweek A herkansen? Meld je uiterlijk ma 23 nov 12.00 uur aan.</w:t>
             </w:r>
           </w:p>
         </w:tc>
@@ -4668,7 +4668,7 @@
                 <w:sz w:val="18"/>
                 <w:szCs w:val="18"/>
               </w:rPr>
-              <w:t xml:space="preserve"> · Terugblik toetsweek A (organisatie). Cijfers invullen zodra ze binnen zijn.</w:t>
+              <w:t xml:space="preserve"> · Terugblik toetsweek A (organisatie). Cijfers invullen zodra ze binnen zijn. Wil je toetsweek A herkansen? Meld je uiterlijk ma 23 nov 12.00 uur aan.</w:t>
             </w:r>
           </w:p>
         </w:tc>
@@ -4814,7 +4814,7 @@
                 <w:sz w:val="18"/>
                 <w:szCs w:val="18"/>
               </w:rPr>
-              <w:t xml:space="preserve"> · Cijfers invullen in je terugblik, check op je doelen afmaken. Extra: kies een docent voor feedback en kondig het aan.</w:t>
+              <w:t xml:space="preserve"> · Cijfers invullen in je terugblik, check op je doelen afmaken. Wil je toetsweek A herkansen? Meld je uiterlijk ma 23 nov 12.00 uur aan. Extra: kies een docent voor feedback en kondig het aan.</w:t>
             </w:r>
           </w:p>
         </w:tc>
@@ -4858,7 +4858,7 @@
                 <w:sz w:val="18"/>
                 <w:szCs w:val="18"/>
               </w:rPr>
-              <w:t xml:space="preserve"> · Terugblik toetsweek A en check op je doelen. Extra: kies een docent voor feedback en kondig het aan.</w:t>
+              <w:t xml:space="preserve"> · Terugblik toetsweek A en check op je doelen. Wil je toetsweek A herkansen? Meld je uiterlijk ma 23 nov 12.00 uur aan. Extra: kies een docent voor feedback en kondig het aan.</w:t>
             </w:r>
           </w:p>
         </w:tc>
@@ -5133,13 +5133,11 @@
             <w:r>
               <w:rPr>
                 <w:rFonts w:ascii="Calibri" w:cs="Calibri" w:eastAsia="Calibri" w:hAnsi="Calibri"/>
-                <w:b/>
-                <w:bCs/>
-                <w:color w:val="1F2328"/>
-                <w:sz w:val="18"/>
-                <w:szCs w:val="18"/>
-              </w:rPr>
-              <w:t xml:space="preserve">ma 23 nov 12.00 uur: aanmelden herkansing A</w:t>
+                <w:color w:val="1F2328"/>
+                <w:sz w:val="18"/>
+                <w:szCs w:val="18"/>
+              </w:rPr>
+              <w:t xml:space="preserve">ma 23 nov 12.00 uur aanmelden herkansing A</w:t>
             </w:r>
           </w:p>
         </w:tc>
@@ -6034,7 +6032,7 @@
                 <w:sz w:val="18"/>
                 <w:szCs w:val="18"/>
               </w:rPr>
-              <w:t xml:space="preserve">ma 4 jan 60-minutenrooster</w:t>
+              <w:t xml:space="preserve">ma 4 jan 60-minutenrooster: valt je les op maandag, dan duurt hij 30 minuten</w:t>
             </w:r>
           </w:p>
         </w:tc>
@@ -6148,7 +6146,7 @@
                 <w:sz w:val="18"/>
                 <w:szCs w:val="18"/>
               </w:rPr>
-              <w:t xml:space="preserve"> · Leren volgens je plan.</w:t>
+              <w:t xml:space="preserve"> · Leren volgens je plan: één vak, een kwartier jezelf overhoren, opschrijven wat je nog niet kon.</w:t>
             </w:r>
           </w:p>
         </w:tc>
@@ -6510,7 +6508,7 @@
                 <w:sz w:val="18"/>
                 <w:szCs w:val="18"/>
               </w:rPr>
-              <w:t xml:space="preserve"> · Terugblik toetsweek B. Spiegel stap 1 en 2: eigen beeld, feedback vragen.</w:t>
+              <w:t xml:space="preserve"> · Terugblik toetsweek B. Spiegel stap 1 en 2: eigen beeld, feedback vragen. Wil je toetsweek B herkansen? Meld je uiterlijk ma 8 feb 12.00 uur aan.</w:t>
             </w:r>
           </w:p>
         </w:tc>
@@ -6553,7 +6551,7 @@
                 <w:sz w:val="18"/>
                 <w:szCs w:val="18"/>
               </w:rPr>
-              <w:t xml:space="preserve"> · Terugblik toetsweek B. Spiegel: eigen beeld invullen, feedback vragen.</w:t>
+              <w:t xml:space="preserve"> · Terugblik toetsweek B. Spiegel: eigen beeld invullen, feedback vragen. Wil je toetsweek B herkansen? Meld je uiterlijk ma 8 feb 12.00 uur aan.</w:t>
             </w:r>
           </w:p>
         </w:tc>
@@ -6699,7 +6697,7 @@
                 <w:sz w:val="18"/>
                 <w:szCs w:val="18"/>
               </w:rPr>
-              <w:t xml:space="preserve"> · Spiegel: feedback invullen en vergelijken met je eigen beeld. Cijfers B invullen.</w:t>
+              <w:t xml:space="preserve"> · Spiegel stap 2 tot en met 4: feedback invullen, vergelijken en bijsturen. Cijfers B invullen. Wil je toetsweek B herkansen? Meld je uiterlijk ma 8 feb 12.00 uur aan.</w:t>
             </w:r>
           </w:p>
         </w:tc>
@@ -6743,7 +6741,7 @@
                 <w:sz w:val="18"/>
                 <w:szCs w:val="18"/>
               </w:rPr>
-              <w:t xml:space="preserve"> · Terugblik toetsweek B. Spiegel stap 1 en 2.</w:t>
+              <w:t xml:space="preserve"> · Terugblik toetsweek B afmaken. Spiegel stap 3 en 4: vergelijken en bijsturen. Wil je toetsweek B herkansen? Meld je uiterlijk ma 8 feb 12.00 uur aan.</w:t>
             </w:r>
           </w:p>
         </w:tc>
@@ -7024,7 +7022,7 @@
                 <w:sz w:val="18"/>
                 <w:szCs w:val="18"/>
               </w:rPr>
-              <w:t xml:space="preserve">Tussenbalans-PDF inleveren (vr 12 feb)</w:t>
+              <w:t xml:space="preserve">Tussenbalans af, PDF van deze les inleveren (vr 12 feb)</w:t>
             </w:r>
           </w:p>
           <w:p>
@@ -7152,7 +7150,7 @@
                 <w:sz w:val="18"/>
                 <w:szCs w:val="18"/>
               </w:rPr>
-              <w:t xml:space="preserve"> · Na het MOL-gesprek: afspraken invullen en terugkijken. LOB deel 2: interview afspreken en voorbereiden.</w:t>
+              <w:t xml:space="preserve"> · Gesprek gehad? Afspraken invullen en terugkijken. LOB deel 2: interview afspreken en voorbereiden.</w:t>
             </w:r>
           </w:p>
         </w:tc>
@@ -7196,7 +7194,7 @@
                 <w:sz w:val="18"/>
                 <w:szCs w:val="18"/>
               </w:rPr>
-              <w:t xml:space="preserve"> · Na het MOL-gesprek: afspraken invullen en terugkijken. Interviewvragen maken.</w:t>
+              <w:t xml:space="preserve"> · Gesprek gehad? Afspraken invullen en terugkijken. Interviewvragen maken.</w:t>
             </w:r>
           </w:p>
         </w:tc>
@@ -7649,7 +7647,7 @@
                 <w:sz w:val="18"/>
                 <w:szCs w:val="18"/>
               </w:rPr>
-              <w:t xml:space="preserve"> · Toetsweekplan C maken. LOB deel 2 afronden. Extra: feedback van je docent verwerken.</w:t>
+              <w:t xml:space="preserve"> · Toetsweekplan C maken. LOB deel 2 afronden en LOB 2-reflectie beginnen. Extra: feedback van je docent verwerken.</w:t>
             </w:r>
           </w:p>
         </w:tc>
@@ -7693,7 +7691,7 @@
                 <w:sz w:val="18"/>
                 <w:szCs w:val="18"/>
               </w:rPr>
-              <w:t xml:space="preserve"> · LOB deel 2 bijwerken. Toetsweekplan C starten. Extra: feedback van je docent verwerken.</w:t>
+              <w:t xml:space="preserve"> · LOB deel 2 bijwerken en LOB 2-reflectie beginnen. Toetsweekplan C starten. Extra: feedback van je docent verwerken.</w:t>
             </w:r>
           </w:p>
         </w:tc>
@@ -7840,7 +7838,7 @@
                 <w:sz w:val="18"/>
                 <w:szCs w:val="18"/>
               </w:rPr>
-              <w:t xml:space="preserve"> · Toetsweekplan C afronden met doelcheck en overgang. LOB 2-reflectie. MOL-gesprek 3 voorbereiden en thuis laten zien.</w:t>
+              <w:t xml:space="preserve"> · Toetsweekplan C afronden met doelcheck en overgang. LOB 2-reflectie afmaken. MOL-gesprek 3 voorbereiden en vóór de toetsweek thuis laten zien.</w:t>
             </w:r>
           </w:p>
         </w:tc>
@@ -7883,7 +7881,7 @@
                 <w:sz w:val="18"/>
                 <w:szCs w:val="18"/>
               </w:rPr>
-              <w:t xml:space="preserve"> · Toetsweekplan C afronden met doelcheck en overgang. LOB deel 2 inleveren, LOB 2-reflectie. MOL-gesprek 3 voorbereiden en thuis laten zien.</w:t>
+              <w:t xml:space="preserve"> · Toetsweekplan C afronden met doelcheck en overgang. LOB deel 2 inleveren, LOB 2-reflectie afmaken. MOL-gesprek 3 voorbereiden en vóór de toetsweek thuis laten zien.</w:t>
             </w:r>
           </w:p>
         </w:tc>
@@ -7917,7 +7915,7 @@
                 <w:sz w:val="18"/>
                 <w:szCs w:val="18"/>
               </w:rPr>
-              <w:t xml:space="preserve">LOB deel 2 inleveren · Toetsweekplan C-PDF inleveren (vr 19 mrt)</w:t>
+              <w:t xml:space="preserve">LOB deel 2 inleveren in Magister · toetsweekplan C af (vr 19 mrt)</w:t>
             </w:r>
           </w:p>
         </w:tc>
@@ -8551,7 +8549,7 @@
                 <w:sz w:val="18"/>
                 <w:szCs w:val="18"/>
               </w:rPr>
-              <w:t xml:space="preserve"> · Terugblik toetsweek C. Uitleg eindpitch.</w:t>
+              <w:t xml:space="preserve"> · Terugblik toetsweek C. Uitleg eindpitch. Wil je herkansen? Schrijf je uiterlijk ma 19 apr 12.00 uur in.</w:t>
             </w:r>
           </w:p>
         </w:tc>
@@ -8594,7 +8592,7 @@
                 <w:sz w:val="18"/>
                 <w:szCs w:val="18"/>
               </w:rPr>
-              <w:t xml:space="preserve"> · Terugblik toetsweek C afmaken met cijfers. Eerste idee voor je pitch.</w:t>
+              <w:t xml:space="preserve"> · Terugblik toetsweek C maken, met je cijfers. Eerste idee voor je pitch. Wil je herkansen? Schrijf je uiterlijk ma 19 apr 12.00 uur in.</w:t>
             </w:r>
           </w:p>
         </w:tc>
@@ -8800,7 +8798,7 @@
                 <w:sz w:val="18"/>
                 <w:szCs w:val="18"/>
               </w:rPr>
-              <w:t xml:space="preserve"> · Herkansing kiezen. Opzet pitch.</w:t>
+              <w:t xml:space="preserve"> · Check of je inschrijving voor de herkansing gelukt is. Opzet pitch.</w:t>
             </w:r>
           </w:p>
         </w:tc>
@@ -8828,27 +8826,11 @@
             <w:r>
               <w:rPr>
                 <w:rFonts w:ascii="Calibri" w:cs="Calibri" w:eastAsia="Calibri" w:hAnsi="Calibri"/>
-                <w:b/>
-                <w:bCs/>
-                <w:color w:val="1F2328"/>
-                <w:sz w:val="18"/>
-                <w:szCs w:val="18"/>
-              </w:rPr>
-              <w:t xml:space="preserve">ma 19 apr 12.00 uur: inschrijven herkansing</w:t>
-            </w:r>
-          </w:p>
-          <w:p>
-            <w:pPr>
-              <w:spacing w:after="40"/>
-            </w:pPr>
-            <w:r>
-              <w:rPr>
-                <w:rFonts w:ascii="Calibri" w:cs="Calibri" w:eastAsia="Calibri" w:hAnsi="Calibri"/>
-                <w:color w:val="1F2328"/>
-                <w:sz w:val="18"/>
-                <w:szCs w:val="18"/>
-              </w:rPr>
-              <w:t xml:space="preserve">do 22 apr herkansen SE’s A, B of C</w:t>
+                <w:color w:val="1F2328"/>
+                <w:sz w:val="18"/>
+                <w:szCs w:val="18"/>
+              </w:rPr>
+              <w:t xml:space="preserve">ma 19 apr 12.00 uur inschrijven herkansing · do 22 apr herkansen SE’s A, B of C</w:t>
             </w:r>
           </w:p>
         </w:tc>
@@ -9386,7 +9368,7 @@
                 <w:sz w:val="18"/>
                 <w:szCs w:val="18"/>
               </w:rPr>
-              <w:t xml:space="preserve">di 18 mei organisatiedag</w:t>
+              <w:t xml:space="preserve">di 18 mei organisatiedag: valt je les op dinsdag, dan vervalt hij</w:t>
             </w:r>
           </w:p>
         </w:tc>
@@ -9721,7 +9703,7 @@
                 <w:sz w:val="18"/>
                 <w:szCs w:val="18"/>
               </w:rPr>
-              <w:t xml:space="preserve"> · Pitch geven.</w:t>
+              <w:t xml:space="preserve"> · Pitch geven. LOB 3-reflectie uiterlijk vr 4 jun.</w:t>
             </w:r>
           </w:p>
         </w:tc>
@@ -10060,7 +10042,7 @@
                 <w:sz w:val="18"/>
                 <w:szCs w:val="18"/>
               </w:rPr>
-              <w:t xml:space="preserve"> · Eindbalans stap 1 tot en met 3.</w:t>
+              <w:t xml:space="preserve"> · Toetsweekplan D: kolom ‘vlak ervoor’ bijwerken. Eindbalans stap 1 tot en met 3 afmaken.</w:t>
             </w:r>
           </w:p>
         </w:tc>
@@ -10403,7 +10385,7 @@
                 <w:sz w:val="18"/>
                 <w:szCs w:val="18"/>
               </w:rPr>
-              <w:t xml:space="preserve">Thuis: eindbalans stap 4 en 5, met je cijfers van toetsweek D. PDF inleveren.</w:t>
+              <w:t xml:space="preserve">Eindbalans stap 4 en 5, met je cijfers van toetsweek D. PDF inleveren.</w:t>
             </w:r>
           </w:p>
           <w:p>
@@ -10451,7 +10433,7 @@
                 <w:sz w:val="18"/>
                 <w:szCs w:val="18"/>
               </w:rPr>
-              <w:t xml:space="preserve">Eindbalans-PDF inleveren (vr 2 jul)</w:t>
+              <w:t xml:space="preserve">Eindbalans af, PDF van deze les inleveren (vr 2 jul)</w:t>
             </w:r>
           </w:p>
         </w:tc>

</xml_diff>

<commit_message>
Halve klas: ritme wisselt na de kerst, groep 2 bereidt MOL 2 en 3 in de klas voor
Co-Authored-By: Claude Fable 5.1 <noreply@anthropic.com>

Claude-Session: https://claude.ai/code/session_01ANGbdbaxhJNxHHij1urWpj
</commit_message>
<xml_diff>
--- a/Jaarplanner_leerlingen_H4E_2026-2027.docx
+++ b/Jaarplanner_leerlingen_H4E_2026-2027.docx
@@ -5696,7 +5696,7 @@
                 <w:sz w:val="18"/>
                 <w:szCs w:val="18"/>
               </w:rPr>
-              <w:t xml:space="preserve">vr 18 dec roostervrij (kerstactiviteiten): valt je les op vrijdag, dan vervalt hij</w:t>
+              <w:t xml:space="preserve">vr 18 dec roostervrij (kerstactiviteiten): valt je les op vrijdag, dan vervalt hij · na de kerst wisselt het ritme: groep 2 in de klas in les 13</w:t>
             </w:r>
           </w:p>
         </w:tc>
@@ -5910,6 +5910,49 @@
               <w:bottom w:val="single" w:color="C9C4B5" w:sz="4"/>
               <w:right w:val="single" w:color="C9C4B5" w:sz="4"/>
             </w:tcBorders>
+            <w:tcMar>
+              <w:top w:type="dxa" w:w="60"/>
+              <w:left w:type="dxa" w:w="90"/>
+              <w:bottom w:type="dxa" w:w="60"/>
+              <w:right w:type="dxa" w:w="90"/>
+            </w:tcMar>
+            <w:vAlign w:val="top"/>
+          </w:tcPr>
+          <w:p>
+            <w:pPr>
+              <w:spacing w:after="40"/>
+            </w:pPr>
+            <w:r>
+              <w:rPr>
+                <w:rFonts w:ascii="Calibri" w:cs="Calibri" w:eastAsia="Calibri" w:hAnsi="Calibri"/>
+                <w:b/>
+                <w:bCs/>
+                <w:color w:val="1F2328"/>
+                <w:sz w:val="18"/>
+                <w:szCs w:val="18"/>
+              </w:rPr>
+              <w:t xml:space="preserve">Thuis</w:t>
+            </w:r>
+            <w:r>
+              <w:rPr>
+                <w:rFonts w:ascii="Calibri" w:cs="Calibri" w:eastAsia="Calibri" w:hAnsi="Calibri"/>
+                <w:color w:val="1F2328"/>
+                <w:sz w:val="18"/>
+                <w:szCs w:val="18"/>
+              </w:rPr>
+              <w:t xml:space="preserve"> · Kolom ‘vlak ervoor’ bijwerken. LOB deel 2: open dag plannen.</w:t>
+            </w:r>
+          </w:p>
+        </w:tc>
+        <w:tc>
+          <w:tcPr>
+            <w:tcW w:type="dxa" w:w="5600"/>
+            <w:tcBorders>
+              <w:top w:val="single" w:color="C9C4B5" w:sz="4"/>
+              <w:left w:val="single" w:color="C9C4B5" w:sz="4"/>
+              <w:bottom w:val="single" w:color="C9C4B5" w:sz="4"/>
+              <w:right w:val="single" w:color="C9C4B5" w:sz="4"/>
+            </w:tcBorders>
             <w:shd w:fill="FBEEE6" w:color="auto" w:val="clear"/>
             <w:tcMar>
               <w:top w:type="dxa" w:w="60"/>
@@ -5947,49 +5990,6 @@
         </w:tc>
         <w:tc>
           <w:tcPr>
-            <w:tcW w:type="dxa" w:w="5600"/>
-            <w:tcBorders>
-              <w:top w:val="single" w:color="C9C4B5" w:sz="4"/>
-              <w:left w:val="single" w:color="C9C4B5" w:sz="4"/>
-              <w:bottom w:val="single" w:color="C9C4B5" w:sz="4"/>
-              <w:right w:val="single" w:color="C9C4B5" w:sz="4"/>
-            </w:tcBorders>
-            <w:tcMar>
-              <w:top w:type="dxa" w:w="60"/>
-              <w:left w:type="dxa" w:w="90"/>
-              <w:bottom w:type="dxa" w:w="60"/>
-              <w:right w:type="dxa" w:w="90"/>
-            </w:tcMar>
-            <w:vAlign w:val="top"/>
-          </w:tcPr>
-          <w:p>
-            <w:pPr>
-              <w:spacing w:after="40"/>
-            </w:pPr>
-            <w:r>
-              <w:rPr>
-                <w:rFonts w:ascii="Calibri" w:cs="Calibri" w:eastAsia="Calibri" w:hAnsi="Calibri"/>
-                <w:b/>
-                <w:bCs/>
-                <w:color w:val="1F2328"/>
-                <w:sz w:val="18"/>
-                <w:szCs w:val="18"/>
-              </w:rPr>
-              <w:t xml:space="preserve">Thuis</w:t>
-            </w:r>
-            <w:r>
-              <w:rPr>
-                <w:rFonts w:ascii="Calibri" w:cs="Calibri" w:eastAsia="Calibri" w:hAnsi="Calibri"/>
-                <w:color w:val="1F2328"/>
-                <w:sz w:val="18"/>
-                <w:szCs w:val="18"/>
-              </w:rPr>
-              <w:t xml:space="preserve"> · Kolom ‘vlak ervoor’ bijwerken. LOB deel 2: open dag plannen.</w:t>
-            </w:r>
-          </w:p>
-        </w:tc>
-        <w:tc>
-          <w:tcPr>
             <w:tcW w:type="dxa" w:w="1998"/>
             <w:tcBorders>
               <w:top w:val="single" w:color="C9C4B5" w:sz="4"/>
@@ -6032,7 +6032,7 @@
                 <w:sz w:val="18"/>
                 <w:szCs w:val="18"/>
               </w:rPr>
-              <w:t xml:space="preserve">ma 4 jan 60-minutenrooster: valt je les op maandag, dan duurt hij 30 minuten</w:t>
+              <w:t xml:space="preserve">ma 4 jan 60-minutenrooster: valt je les op maandag, dan duurt hij 30 minuten · vanaf nu zit groep 2 in de oneven lessen in de klas</w:t>
             </w:r>
           </w:p>
         </w:tc>
@@ -6116,6 +6116,50 @@
               <w:bottom w:val="single" w:color="C9C4B5" w:sz="4"/>
               <w:right w:val="single" w:color="C9C4B5" w:sz="4"/>
             </w:tcBorders>
+            <w:shd w:fill="FBEEE6" w:color="auto" w:val="clear"/>
+            <w:tcMar>
+              <w:top w:type="dxa" w:w="60"/>
+              <w:left w:type="dxa" w:w="90"/>
+              <w:bottom w:type="dxa" w:w="60"/>
+              <w:right w:type="dxa" w:w="90"/>
+            </w:tcMar>
+            <w:vAlign w:val="top"/>
+          </w:tcPr>
+          <w:p>
+            <w:pPr>
+              <w:spacing w:after="40"/>
+            </w:pPr>
+            <w:r>
+              <w:rPr>
+                <w:rFonts w:ascii="Calibri" w:cs="Calibri" w:eastAsia="Calibri" w:hAnsi="Calibri"/>
+                <w:b/>
+                <w:bCs/>
+                <w:color w:val="1F2328"/>
+                <w:sz w:val="18"/>
+                <w:szCs w:val="18"/>
+              </w:rPr>
+              <w:t xml:space="preserve">In de klas</w:t>
+            </w:r>
+            <w:r>
+              <w:rPr>
+                <w:rFonts w:ascii="Calibri" w:cs="Calibri" w:eastAsia="Calibri" w:hAnsi="Calibri"/>
+                <w:color w:val="1F2328"/>
+                <w:sz w:val="18"/>
+                <w:szCs w:val="18"/>
+              </w:rPr>
+              <w:t xml:space="preserve"> · Kolom ‘vlak ervoor’ bijwerken.</w:t>
+            </w:r>
+          </w:p>
+        </w:tc>
+        <w:tc>
+          <w:tcPr>
+            <w:tcW w:type="dxa" w:w="5600"/>
+            <w:tcBorders>
+              <w:top w:val="single" w:color="C9C4B5" w:sz="4"/>
+              <w:left w:val="single" w:color="C9C4B5" w:sz="4"/>
+              <w:bottom w:val="single" w:color="C9C4B5" w:sz="4"/>
+              <w:right w:val="single" w:color="C9C4B5" w:sz="4"/>
+            </w:tcBorders>
             <w:tcMar>
               <w:top w:type="dxa" w:w="60"/>
               <w:left w:type="dxa" w:w="90"/>
@@ -6147,50 +6191,6 @@
                 <w:szCs w:val="18"/>
               </w:rPr>
               <w:t xml:space="preserve"> · Leren volgens je plan: één vak, een kwartier jezelf overhoren, opschrijven wat je nog niet kon.</w:t>
-            </w:r>
-          </w:p>
-        </w:tc>
-        <w:tc>
-          <w:tcPr>
-            <w:tcW w:type="dxa" w:w="5600"/>
-            <w:tcBorders>
-              <w:top w:val="single" w:color="C9C4B5" w:sz="4"/>
-              <w:left w:val="single" w:color="C9C4B5" w:sz="4"/>
-              <w:bottom w:val="single" w:color="C9C4B5" w:sz="4"/>
-              <w:right w:val="single" w:color="C9C4B5" w:sz="4"/>
-            </w:tcBorders>
-            <w:shd w:fill="FBEEE6" w:color="auto" w:val="clear"/>
-            <w:tcMar>
-              <w:top w:type="dxa" w:w="60"/>
-              <w:left w:type="dxa" w:w="90"/>
-              <w:bottom w:type="dxa" w:w="60"/>
-              <w:right w:type="dxa" w:w="90"/>
-            </w:tcMar>
-            <w:vAlign w:val="top"/>
-          </w:tcPr>
-          <w:p>
-            <w:pPr>
-              <w:spacing w:after="40"/>
-            </w:pPr>
-            <w:r>
-              <w:rPr>
-                <w:rFonts w:ascii="Calibri" w:cs="Calibri" w:eastAsia="Calibri" w:hAnsi="Calibri"/>
-                <w:b/>
-                <w:bCs/>
-                <w:color w:val="1F2328"/>
-                <w:sz w:val="18"/>
-                <w:szCs w:val="18"/>
-              </w:rPr>
-              <w:t xml:space="preserve">In de klas</w:t>
-            </w:r>
-            <w:r>
-              <w:rPr>
-                <w:rFonts w:ascii="Calibri" w:cs="Calibri" w:eastAsia="Calibri" w:hAnsi="Calibri"/>
-                <w:color w:val="1F2328"/>
-                <w:sz w:val="18"/>
-                <w:szCs w:val="18"/>
-              </w:rPr>
-              <w:t xml:space="preserve"> · Kolom ‘vlak ervoor’ bijwerken.</w:t>
             </w:r>
           </w:p>
         </w:tc>
@@ -6477,6 +6477,49 @@
               <w:bottom w:val="single" w:color="C9C4B5" w:sz="4"/>
               <w:right w:val="single" w:color="C9C4B5" w:sz="4"/>
             </w:tcBorders>
+            <w:tcMar>
+              <w:top w:type="dxa" w:w="60"/>
+              <w:left w:type="dxa" w:w="90"/>
+              <w:bottom w:type="dxa" w:w="60"/>
+              <w:right w:type="dxa" w:w="90"/>
+            </w:tcMar>
+            <w:vAlign w:val="top"/>
+          </w:tcPr>
+          <w:p>
+            <w:pPr>
+              <w:spacing w:after="40"/>
+            </w:pPr>
+            <w:r>
+              <w:rPr>
+                <w:rFonts w:ascii="Calibri" w:cs="Calibri" w:eastAsia="Calibri" w:hAnsi="Calibri"/>
+                <w:b/>
+                <w:bCs/>
+                <w:color w:val="1F2328"/>
+                <w:sz w:val="18"/>
+                <w:szCs w:val="18"/>
+              </w:rPr>
+              <w:t xml:space="preserve">Thuis</w:t>
+            </w:r>
+            <w:r>
+              <w:rPr>
+                <w:rFonts w:ascii="Calibri" w:cs="Calibri" w:eastAsia="Calibri" w:hAnsi="Calibri"/>
+                <w:color w:val="1F2328"/>
+                <w:sz w:val="18"/>
+                <w:szCs w:val="18"/>
+              </w:rPr>
+              <w:t xml:space="preserve"> · Terugblik toetsweek B. Spiegel: eigen beeld invullen, feedback vragen. Wil je toetsweek B herkansen? Meld je uiterlijk ma 8 feb 12.00 uur aan.</w:t>
+            </w:r>
+          </w:p>
+        </w:tc>
+        <w:tc>
+          <w:tcPr>
+            <w:tcW w:type="dxa" w:w="5600"/>
+            <w:tcBorders>
+              <w:top w:val="single" w:color="C9C4B5" w:sz="4"/>
+              <w:left w:val="single" w:color="C9C4B5" w:sz="4"/>
+              <w:bottom w:val="single" w:color="C9C4B5" w:sz="4"/>
+              <w:right w:val="single" w:color="C9C4B5" w:sz="4"/>
+            </w:tcBorders>
             <w:shd w:fill="FBEEE6" w:color="auto" w:val="clear"/>
             <w:tcMar>
               <w:top w:type="dxa" w:w="60"/>
@@ -6509,49 +6552,6 @@
                 <w:szCs w:val="18"/>
               </w:rPr>
               <w:t xml:space="preserve"> · Terugblik toetsweek B. Spiegel stap 1 en 2: eigen beeld, feedback vragen. Wil je toetsweek B herkansen? Meld je uiterlijk ma 8 feb 12.00 uur aan.</w:t>
-            </w:r>
-          </w:p>
-        </w:tc>
-        <w:tc>
-          <w:tcPr>
-            <w:tcW w:type="dxa" w:w="5600"/>
-            <w:tcBorders>
-              <w:top w:val="single" w:color="C9C4B5" w:sz="4"/>
-              <w:left w:val="single" w:color="C9C4B5" w:sz="4"/>
-              <w:bottom w:val="single" w:color="C9C4B5" w:sz="4"/>
-              <w:right w:val="single" w:color="C9C4B5" w:sz="4"/>
-            </w:tcBorders>
-            <w:tcMar>
-              <w:top w:type="dxa" w:w="60"/>
-              <w:left w:type="dxa" w:w="90"/>
-              <w:bottom w:type="dxa" w:w="60"/>
-              <w:right w:type="dxa" w:w="90"/>
-            </w:tcMar>
-            <w:vAlign w:val="top"/>
-          </w:tcPr>
-          <w:p>
-            <w:pPr>
-              <w:spacing w:after="40"/>
-            </w:pPr>
-            <w:r>
-              <w:rPr>
-                <w:rFonts w:ascii="Calibri" w:cs="Calibri" w:eastAsia="Calibri" w:hAnsi="Calibri"/>
-                <w:b/>
-                <w:bCs/>
-                <w:color w:val="1F2328"/>
-                <w:sz w:val="18"/>
-                <w:szCs w:val="18"/>
-              </w:rPr>
-              <w:t xml:space="preserve">Thuis</w:t>
-            </w:r>
-            <w:r>
-              <w:rPr>
-                <w:rFonts w:ascii="Calibri" w:cs="Calibri" w:eastAsia="Calibri" w:hAnsi="Calibri"/>
-                <w:color w:val="1F2328"/>
-                <w:sz w:val="18"/>
-                <w:szCs w:val="18"/>
-              </w:rPr>
-              <w:t xml:space="preserve"> · Terugblik toetsweek B. Spiegel: eigen beeld invullen, feedback vragen. Wil je toetsweek B herkansen? Meld je uiterlijk ma 8 feb 12.00 uur aan.</w:t>
             </w:r>
           </w:p>
         </w:tc>
@@ -6667,6 +6667,50 @@
               <w:bottom w:val="single" w:color="C9C4B5" w:sz="4"/>
               <w:right w:val="single" w:color="C9C4B5" w:sz="4"/>
             </w:tcBorders>
+            <w:shd w:fill="FBEEE6" w:color="auto" w:val="clear"/>
+            <w:tcMar>
+              <w:top w:type="dxa" w:w="60"/>
+              <w:left w:type="dxa" w:w="90"/>
+              <w:bottom w:type="dxa" w:w="60"/>
+              <w:right w:type="dxa" w:w="90"/>
+            </w:tcMar>
+            <w:vAlign w:val="top"/>
+          </w:tcPr>
+          <w:p>
+            <w:pPr>
+              <w:spacing w:after="40"/>
+            </w:pPr>
+            <w:r>
+              <w:rPr>
+                <w:rFonts w:ascii="Calibri" w:cs="Calibri" w:eastAsia="Calibri" w:hAnsi="Calibri"/>
+                <w:b/>
+                <w:bCs/>
+                <w:color w:val="1F2328"/>
+                <w:sz w:val="18"/>
+                <w:szCs w:val="18"/>
+              </w:rPr>
+              <w:t xml:space="preserve">In de klas</w:t>
+            </w:r>
+            <w:r>
+              <w:rPr>
+                <w:rFonts w:ascii="Calibri" w:cs="Calibri" w:eastAsia="Calibri" w:hAnsi="Calibri"/>
+                <w:color w:val="1F2328"/>
+                <w:sz w:val="18"/>
+                <w:szCs w:val="18"/>
+              </w:rPr>
+              <w:t xml:space="preserve"> · Terugblik toetsweek B afmaken. Spiegel stap 3 en 4: vergelijken en bijsturen. Wil je toetsweek B herkansen? Meld je uiterlijk ma 8 feb 12.00 uur aan.</w:t>
+            </w:r>
+          </w:p>
+        </w:tc>
+        <w:tc>
+          <w:tcPr>
+            <w:tcW w:type="dxa" w:w="5600"/>
+            <w:tcBorders>
+              <w:top w:val="single" w:color="C9C4B5" w:sz="4"/>
+              <w:left w:val="single" w:color="C9C4B5" w:sz="4"/>
+              <w:bottom w:val="single" w:color="C9C4B5" w:sz="4"/>
+              <w:right w:val="single" w:color="C9C4B5" w:sz="4"/>
+            </w:tcBorders>
             <w:tcMar>
               <w:top w:type="dxa" w:w="60"/>
               <w:left w:type="dxa" w:w="90"/>
@@ -6698,50 +6742,6 @@
                 <w:szCs w:val="18"/>
               </w:rPr>
               <w:t xml:space="preserve"> · Spiegel stap 2 tot en met 4: feedback invullen, vergelijken en bijsturen. Cijfers B invullen. Wil je toetsweek B herkansen? Meld je uiterlijk ma 8 feb 12.00 uur aan.</w:t>
-            </w:r>
-          </w:p>
-        </w:tc>
-        <w:tc>
-          <w:tcPr>
-            <w:tcW w:type="dxa" w:w="5600"/>
-            <w:tcBorders>
-              <w:top w:val="single" w:color="C9C4B5" w:sz="4"/>
-              <w:left w:val="single" w:color="C9C4B5" w:sz="4"/>
-              <w:bottom w:val="single" w:color="C9C4B5" w:sz="4"/>
-              <w:right w:val="single" w:color="C9C4B5" w:sz="4"/>
-            </w:tcBorders>
-            <w:shd w:fill="FBEEE6" w:color="auto" w:val="clear"/>
-            <w:tcMar>
-              <w:top w:type="dxa" w:w="60"/>
-              <w:left w:type="dxa" w:w="90"/>
-              <w:bottom w:type="dxa" w:w="60"/>
-              <w:right w:type="dxa" w:w="90"/>
-            </w:tcMar>
-            <w:vAlign w:val="top"/>
-          </w:tcPr>
-          <w:p>
-            <w:pPr>
-              <w:spacing w:after="40"/>
-            </w:pPr>
-            <w:r>
-              <w:rPr>
-                <w:rFonts w:ascii="Calibri" w:cs="Calibri" w:eastAsia="Calibri" w:hAnsi="Calibri"/>
-                <w:b/>
-                <w:bCs/>
-                <w:color w:val="1F2328"/>
-                <w:sz w:val="18"/>
-                <w:szCs w:val="18"/>
-              </w:rPr>
-              <w:t xml:space="preserve">In de klas</w:t>
-            </w:r>
-            <w:r>
-              <w:rPr>
-                <w:rFonts w:ascii="Calibri" w:cs="Calibri" w:eastAsia="Calibri" w:hAnsi="Calibri"/>
-                <w:color w:val="1F2328"/>
-                <w:sz w:val="18"/>
-                <w:szCs w:val="18"/>
-              </w:rPr>
-              <w:t xml:space="preserve"> · Terugblik toetsweek B afmaken. Spiegel stap 3 en 4: vergelijken en bijsturen. Wil je toetsweek B herkansen? Meld je uiterlijk ma 8 feb 12.00 uur aan.</w:t>
             </w:r>
           </w:p>
         </w:tc>
@@ -6914,6 +6914,49 @@
               <w:bottom w:val="single" w:color="C9C4B5" w:sz="4"/>
               <w:right w:val="single" w:color="C9C4B5" w:sz="4"/>
             </w:tcBorders>
+            <w:tcMar>
+              <w:top w:type="dxa" w:w="60"/>
+              <w:left w:type="dxa" w:w="90"/>
+              <w:bottom w:type="dxa" w:w="60"/>
+              <w:right w:type="dxa" w:w="90"/>
+            </w:tcMar>
+            <w:vAlign w:val="top"/>
+          </w:tcPr>
+          <w:p>
+            <w:pPr>
+              <w:spacing w:after="40"/>
+            </w:pPr>
+            <w:r>
+              <w:rPr>
+                <w:rFonts w:ascii="Calibri" w:cs="Calibri" w:eastAsia="Calibri" w:hAnsi="Calibri"/>
+                <w:b/>
+                <w:bCs/>
+                <w:color w:val="1F2328"/>
+                <w:sz w:val="18"/>
+                <w:szCs w:val="18"/>
+              </w:rPr>
+              <w:t xml:space="preserve">Thuis</w:t>
+            </w:r>
+            <w:r>
+              <w:rPr>
+                <w:rFonts w:ascii="Calibri" w:cs="Calibri" w:eastAsia="Calibri" w:hAnsi="Calibri"/>
+                <w:color w:val="1F2328"/>
+                <w:sz w:val="18"/>
+                <w:szCs w:val="18"/>
+              </w:rPr>
+              <w:t xml:space="preserve"> · Tussenbalans maken. MOL-gesprek 2 voorbereiden (spiekkaart) en thuis laten zien. PDF inleveren.</w:t>
+            </w:r>
+          </w:p>
+        </w:tc>
+        <w:tc>
+          <w:tcPr>
+            <w:tcW w:type="dxa" w:w="5600"/>
+            <w:tcBorders>
+              <w:top w:val="single" w:color="C9C4B5" w:sz="4"/>
+              <w:left w:val="single" w:color="C9C4B5" w:sz="4"/>
+              <w:bottom w:val="single" w:color="C9C4B5" w:sz="4"/>
+              <w:right w:val="single" w:color="C9C4B5" w:sz="4"/>
+            </w:tcBorders>
             <w:shd w:fill="E3EFEF" w:color="auto" w:val="clear"/>
             <w:tcMar>
               <w:top w:type="dxa" w:w="60"/>
@@ -6937,49 +6980,6 @@
                 <w:szCs w:val="18"/>
               </w:rPr>
               <w:t xml:space="preserve">In de klas</w:t>
-            </w:r>
-            <w:r>
-              <w:rPr>
-                <w:rFonts w:ascii="Calibri" w:cs="Calibri" w:eastAsia="Calibri" w:hAnsi="Calibri"/>
-                <w:color w:val="1F2328"/>
-                <w:sz w:val="18"/>
-                <w:szCs w:val="18"/>
-              </w:rPr>
-              <w:t xml:space="preserve"> · Tussenbalans maken. MOL-gesprek 2 voorbereiden (spiekkaart) en thuis laten zien. PDF inleveren.</w:t>
-            </w:r>
-          </w:p>
-        </w:tc>
-        <w:tc>
-          <w:tcPr>
-            <w:tcW w:type="dxa" w:w="5600"/>
-            <w:tcBorders>
-              <w:top w:val="single" w:color="C9C4B5" w:sz="4"/>
-              <w:left w:val="single" w:color="C9C4B5" w:sz="4"/>
-              <w:bottom w:val="single" w:color="C9C4B5" w:sz="4"/>
-              <w:right w:val="single" w:color="C9C4B5" w:sz="4"/>
-            </w:tcBorders>
-            <w:tcMar>
-              <w:top w:type="dxa" w:w="60"/>
-              <w:left w:type="dxa" w:w="90"/>
-              <w:bottom w:type="dxa" w:w="60"/>
-              <w:right w:type="dxa" w:w="90"/>
-            </w:tcMar>
-            <w:vAlign w:val="top"/>
-          </w:tcPr>
-          <w:p>
-            <w:pPr>
-              <w:spacing w:after="40"/>
-            </w:pPr>
-            <w:r>
-              <w:rPr>
-                <w:rFonts w:ascii="Calibri" w:cs="Calibri" w:eastAsia="Calibri" w:hAnsi="Calibri"/>
-                <w:b/>
-                <w:bCs/>
-                <w:color w:val="1F2328"/>
-                <w:sz w:val="18"/>
-                <w:szCs w:val="18"/>
-              </w:rPr>
-              <w:t xml:space="preserve">Thuis</w:t>
             </w:r>
             <w:r>
               <w:rPr>
@@ -7120,6 +7120,50 @@
               <w:bottom w:val="single" w:color="C9C4B5" w:sz="4"/>
               <w:right w:val="single" w:color="C9C4B5" w:sz="4"/>
             </w:tcBorders>
+            <w:shd w:fill="EFE9F7" w:color="auto" w:val="clear"/>
+            <w:tcMar>
+              <w:top w:type="dxa" w:w="60"/>
+              <w:left w:type="dxa" w:w="90"/>
+              <w:bottom w:type="dxa" w:w="60"/>
+              <w:right w:type="dxa" w:w="90"/>
+            </w:tcMar>
+            <w:vAlign w:val="top"/>
+          </w:tcPr>
+          <w:p>
+            <w:pPr>
+              <w:spacing w:after="40"/>
+            </w:pPr>
+            <w:r>
+              <w:rPr>
+                <w:rFonts w:ascii="Calibri" w:cs="Calibri" w:eastAsia="Calibri" w:hAnsi="Calibri"/>
+                <w:b/>
+                <w:bCs/>
+                <w:color w:val="1F2328"/>
+                <w:sz w:val="18"/>
+                <w:szCs w:val="18"/>
+              </w:rPr>
+              <w:t xml:space="preserve">In de klas</w:t>
+            </w:r>
+            <w:r>
+              <w:rPr>
+                <w:rFonts w:ascii="Calibri" w:cs="Calibri" w:eastAsia="Calibri" w:hAnsi="Calibri"/>
+                <w:color w:val="1F2328"/>
+                <w:sz w:val="18"/>
+                <w:szCs w:val="18"/>
+              </w:rPr>
+              <w:t xml:space="preserve"> · Gesprek gehad? Afspraken invullen en terugkijken. Interviewvragen maken.</w:t>
+            </w:r>
+          </w:p>
+        </w:tc>
+        <w:tc>
+          <w:tcPr>
+            <w:tcW w:type="dxa" w:w="5600"/>
+            <w:tcBorders>
+              <w:top w:val="single" w:color="C9C4B5" w:sz="4"/>
+              <w:left w:val="single" w:color="C9C4B5" w:sz="4"/>
+              <w:bottom w:val="single" w:color="C9C4B5" w:sz="4"/>
+              <w:right w:val="single" w:color="C9C4B5" w:sz="4"/>
+            </w:tcBorders>
             <w:tcMar>
               <w:top w:type="dxa" w:w="60"/>
               <w:left w:type="dxa" w:w="90"/>
@@ -7151,50 +7195,6 @@
                 <w:szCs w:val="18"/>
               </w:rPr>
               <w:t xml:space="preserve"> · Gesprek gehad? Afspraken invullen en terugkijken. LOB deel 2: interview afspreken en voorbereiden.</w:t>
-            </w:r>
-          </w:p>
-        </w:tc>
-        <w:tc>
-          <w:tcPr>
-            <w:tcW w:type="dxa" w:w="5600"/>
-            <w:tcBorders>
-              <w:top w:val="single" w:color="C9C4B5" w:sz="4"/>
-              <w:left w:val="single" w:color="C9C4B5" w:sz="4"/>
-              <w:bottom w:val="single" w:color="C9C4B5" w:sz="4"/>
-              <w:right w:val="single" w:color="C9C4B5" w:sz="4"/>
-            </w:tcBorders>
-            <w:shd w:fill="EFE9F7" w:color="auto" w:val="clear"/>
-            <w:tcMar>
-              <w:top w:type="dxa" w:w="60"/>
-              <w:left w:type="dxa" w:w="90"/>
-              <w:bottom w:type="dxa" w:w="60"/>
-              <w:right w:type="dxa" w:w="90"/>
-            </w:tcMar>
-            <w:vAlign w:val="top"/>
-          </w:tcPr>
-          <w:p>
-            <w:pPr>
-              <w:spacing w:after="40"/>
-            </w:pPr>
-            <w:r>
-              <w:rPr>
-                <w:rFonts w:ascii="Calibri" w:cs="Calibri" w:eastAsia="Calibri" w:hAnsi="Calibri"/>
-                <w:b/>
-                <w:bCs/>
-                <w:color w:val="1F2328"/>
-                <w:sz w:val="18"/>
-                <w:szCs w:val="18"/>
-              </w:rPr>
-              <w:t xml:space="preserve">In de klas</w:t>
-            </w:r>
-            <w:r>
-              <w:rPr>
-                <w:rFonts w:ascii="Calibri" w:cs="Calibri" w:eastAsia="Calibri" w:hAnsi="Calibri"/>
-                <w:color w:val="1F2328"/>
-                <w:sz w:val="18"/>
-                <w:szCs w:val="18"/>
-              </w:rPr>
-              <w:t xml:space="preserve"> · Gesprek gehad? Afspraken invullen en terugkijken. Interviewvragen maken.</w:t>
             </w:r>
           </w:p>
         </w:tc>
@@ -7440,6 +7440,49 @@
               <w:bottom w:val="single" w:color="C9C4B5" w:sz="4"/>
               <w:right w:val="single" w:color="C9C4B5" w:sz="4"/>
             </w:tcBorders>
+            <w:tcMar>
+              <w:top w:type="dxa" w:w="60"/>
+              <w:left w:type="dxa" w:w="90"/>
+              <w:bottom w:type="dxa" w:w="60"/>
+              <w:right w:type="dxa" w:w="90"/>
+            </w:tcMar>
+            <w:vAlign w:val="top"/>
+          </w:tcPr>
+          <w:p>
+            <w:pPr>
+              <w:spacing w:after="40"/>
+            </w:pPr>
+            <w:r>
+              <w:rPr>
+                <w:rFonts w:ascii="Calibri" w:cs="Calibri" w:eastAsia="Calibri" w:hAnsi="Calibri"/>
+                <w:b/>
+                <w:bCs/>
+                <w:color w:val="1F2328"/>
+                <w:sz w:val="18"/>
+                <w:szCs w:val="18"/>
+              </w:rPr>
+              <w:t xml:space="preserve">Thuis</w:t>
+            </w:r>
+            <w:r>
+              <w:rPr>
+                <w:rFonts w:ascii="Calibri" w:cs="Calibri" w:eastAsia="Calibri" w:hAnsi="Calibri"/>
+                <w:color w:val="1F2328"/>
+                <w:sz w:val="18"/>
+                <w:szCs w:val="18"/>
+              </w:rPr>
+              <w:t xml:space="preserve"> · LOB deel 2: vergelijking opleidingen en drie beroepen. Extra: kies een docent voor feedback en kondig het aan.</w:t>
+            </w:r>
+          </w:p>
+        </w:tc>
+        <w:tc>
+          <w:tcPr>
+            <w:tcW w:type="dxa" w:w="5600"/>
+            <w:tcBorders>
+              <w:top w:val="single" w:color="C9C4B5" w:sz="4"/>
+              <w:left w:val="single" w:color="C9C4B5" w:sz="4"/>
+              <w:bottom w:val="single" w:color="C9C4B5" w:sz="4"/>
+              <w:right w:val="single" w:color="C9C4B5" w:sz="4"/>
+            </w:tcBorders>
             <w:shd w:fill="EFE9F7" w:color="auto" w:val="clear"/>
             <w:tcMar>
               <w:top w:type="dxa" w:w="60"/>
@@ -7472,49 +7515,6 @@
                 <w:szCs w:val="18"/>
               </w:rPr>
               <w:t xml:space="preserve"> · LOB deel 2 bijwerken. Toetsweekplan C starten. Extra: kies een docent voor feedback en kondig het aan.</w:t>
-            </w:r>
-          </w:p>
-        </w:tc>
-        <w:tc>
-          <w:tcPr>
-            <w:tcW w:type="dxa" w:w="5600"/>
-            <w:tcBorders>
-              <w:top w:val="single" w:color="C9C4B5" w:sz="4"/>
-              <w:left w:val="single" w:color="C9C4B5" w:sz="4"/>
-              <w:bottom w:val="single" w:color="C9C4B5" w:sz="4"/>
-              <w:right w:val="single" w:color="C9C4B5" w:sz="4"/>
-            </w:tcBorders>
-            <w:tcMar>
-              <w:top w:type="dxa" w:w="60"/>
-              <w:left w:type="dxa" w:w="90"/>
-              <w:bottom w:type="dxa" w:w="60"/>
-              <w:right w:type="dxa" w:w="90"/>
-            </w:tcMar>
-            <w:vAlign w:val="top"/>
-          </w:tcPr>
-          <w:p>
-            <w:pPr>
-              <w:spacing w:after="40"/>
-            </w:pPr>
-            <w:r>
-              <w:rPr>
-                <w:rFonts w:ascii="Calibri" w:cs="Calibri" w:eastAsia="Calibri" w:hAnsi="Calibri"/>
-                <w:b/>
-                <w:bCs/>
-                <w:color w:val="1F2328"/>
-                <w:sz w:val="18"/>
-                <w:szCs w:val="18"/>
-              </w:rPr>
-              <w:t xml:space="preserve">Thuis</w:t>
-            </w:r>
-            <w:r>
-              <w:rPr>
-                <w:rFonts w:ascii="Calibri" w:cs="Calibri" w:eastAsia="Calibri" w:hAnsi="Calibri"/>
-                <w:color w:val="1F2328"/>
-                <w:sz w:val="18"/>
-                <w:szCs w:val="18"/>
-              </w:rPr>
-              <w:t xml:space="preserve"> · LOB deel 2: vergelijking opleidingen en drie beroepen. Extra: kies een docent voor feedback en kondig het aan.</w:t>
             </w:r>
           </w:p>
         </w:tc>
@@ -7617,6 +7617,50 @@
               <w:bottom w:val="single" w:color="C9C4B5" w:sz="4"/>
               <w:right w:val="single" w:color="C9C4B5" w:sz="4"/>
             </w:tcBorders>
+            <w:shd w:fill="EFE9F7" w:color="auto" w:val="clear"/>
+            <w:tcMar>
+              <w:top w:type="dxa" w:w="60"/>
+              <w:left w:type="dxa" w:w="90"/>
+              <w:bottom w:type="dxa" w:w="60"/>
+              <w:right w:type="dxa" w:w="90"/>
+            </w:tcMar>
+            <w:vAlign w:val="top"/>
+          </w:tcPr>
+          <w:p>
+            <w:pPr>
+              <w:spacing w:after="40"/>
+            </w:pPr>
+            <w:r>
+              <w:rPr>
+                <w:rFonts w:ascii="Calibri" w:cs="Calibri" w:eastAsia="Calibri" w:hAnsi="Calibri"/>
+                <w:b/>
+                <w:bCs/>
+                <w:color w:val="1F2328"/>
+                <w:sz w:val="18"/>
+                <w:szCs w:val="18"/>
+              </w:rPr>
+              <w:t xml:space="preserve">In de klas</w:t>
+            </w:r>
+            <w:r>
+              <w:rPr>
+                <w:rFonts w:ascii="Calibri" w:cs="Calibri" w:eastAsia="Calibri" w:hAnsi="Calibri"/>
+                <w:color w:val="1F2328"/>
+                <w:sz w:val="18"/>
+                <w:szCs w:val="18"/>
+              </w:rPr>
+              <w:t xml:space="preserve"> · LOB deel 2 bijwerken en LOB 2-reflectie beginnen. Toetsweekplan C starten. Extra: feedback van je docent verwerken.</w:t>
+            </w:r>
+          </w:p>
+        </w:tc>
+        <w:tc>
+          <w:tcPr>
+            <w:tcW w:type="dxa" w:w="5600"/>
+            <w:tcBorders>
+              <w:top w:val="single" w:color="C9C4B5" w:sz="4"/>
+              <w:left w:val="single" w:color="C9C4B5" w:sz="4"/>
+              <w:bottom w:val="single" w:color="C9C4B5" w:sz="4"/>
+              <w:right w:val="single" w:color="C9C4B5" w:sz="4"/>
+            </w:tcBorders>
             <w:tcMar>
               <w:top w:type="dxa" w:w="60"/>
               <w:left w:type="dxa" w:w="90"/>
@@ -7648,50 +7692,6 @@
                 <w:szCs w:val="18"/>
               </w:rPr>
               <w:t xml:space="preserve"> · Toetsweekplan C maken. LOB deel 2 afronden en LOB 2-reflectie beginnen. Extra: feedback van je docent verwerken.</w:t>
-            </w:r>
-          </w:p>
-        </w:tc>
-        <w:tc>
-          <w:tcPr>
-            <w:tcW w:type="dxa" w:w="5600"/>
-            <w:tcBorders>
-              <w:top w:val="single" w:color="C9C4B5" w:sz="4"/>
-              <w:left w:val="single" w:color="C9C4B5" w:sz="4"/>
-              <w:bottom w:val="single" w:color="C9C4B5" w:sz="4"/>
-              <w:right w:val="single" w:color="C9C4B5" w:sz="4"/>
-            </w:tcBorders>
-            <w:shd w:fill="EFE9F7" w:color="auto" w:val="clear"/>
-            <w:tcMar>
-              <w:top w:type="dxa" w:w="60"/>
-              <w:left w:type="dxa" w:w="90"/>
-              <w:bottom w:type="dxa" w:w="60"/>
-              <w:right w:type="dxa" w:w="90"/>
-            </w:tcMar>
-            <w:vAlign w:val="top"/>
-          </w:tcPr>
-          <w:p>
-            <w:pPr>
-              <w:spacing w:after="40"/>
-            </w:pPr>
-            <w:r>
-              <w:rPr>
-                <w:rFonts w:ascii="Calibri" w:cs="Calibri" w:eastAsia="Calibri" w:hAnsi="Calibri"/>
-                <w:b/>
-                <w:bCs/>
-                <w:color w:val="1F2328"/>
-                <w:sz w:val="18"/>
-                <w:szCs w:val="18"/>
-              </w:rPr>
-              <w:t xml:space="preserve">In de klas</w:t>
-            </w:r>
-            <w:r>
-              <w:rPr>
-                <w:rFonts w:ascii="Calibri" w:cs="Calibri" w:eastAsia="Calibri" w:hAnsi="Calibri"/>
-                <w:color w:val="1F2328"/>
-                <w:sz w:val="18"/>
-                <w:szCs w:val="18"/>
-              </w:rPr>
-              <w:t xml:space="preserve"> · LOB deel 2 bijwerken en LOB 2-reflectie beginnen. Toetsweekplan C starten. Extra: feedback van je docent verwerken.</w:t>
             </w:r>
           </w:p>
         </w:tc>
@@ -7807,6 +7807,49 @@
               <w:bottom w:val="single" w:color="C9C4B5" w:sz="4"/>
               <w:right w:val="single" w:color="C9C4B5" w:sz="4"/>
             </w:tcBorders>
+            <w:tcMar>
+              <w:top w:type="dxa" w:w="60"/>
+              <w:left w:type="dxa" w:w="90"/>
+              <w:bottom w:type="dxa" w:w="60"/>
+              <w:right w:type="dxa" w:w="90"/>
+            </w:tcMar>
+            <w:vAlign w:val="top"/>
+          </w:tcPr>
+          <w:p>
+            <w:pPr>
+              <w:spacing w:after="40"/>
+            </w:pPr>
+            <w:r>
+              <w:rPr>
+                <w:rFonts w:ascii="Calibri" w:cs="Calibri" w:eastAsia="Calibri" w:hAnsi="Calibri"/>
+                <w:b/>
+                <w:bCs/>
+                <w:color w:val="1F2328"/>
+                <w:sz w:val="18"/>
+                <w:szCs w:val="18"/>
+              </w:rPr>
+              <w:t xml:space="preserve">Thuis</w:t>
+            </w:r>
+            <w:r>
+              <w:rPr>
+                <w:rFonts w:ascii="Calibri" w:cs="Calibri" w:eastAsia="Calibri" w:hAnsi="Calibri"/>
+                <w:color w:val="1F2328"/>
+                <w:sz w:val="18"/>
+                <w:szCs w:val="18"/>
+              </w:rPr>
+              <w:t xml:space="preserve"> · Toetsweekplan C afronden met doelcheck en overgang. LOB deel 2 inleveren, LOB 2-reflectie afmaken. MOL-gesprek 3 voorbereiden en vóór de toetsweek thuis laten zien.</w:t>
+            </w:r>
+          </w:p>
+        </w:tc>
+        <w:tc>
+          <w:tcPr>
+            <w:tcW w:type="dxa" w:w="5600"/>
+            <w:tcBorders>
+              <w:top w:val="single" w:color="C9C4B5" w:sz="4"/>
+              <w:left w:val="single" w:color="C9C4B5" w:sz="4"/>
+              <w:bottom w:val="single" w:color="C9C4B5" w:sz="4"/>
+              <w:right w:val="single" w:color="C9C4B5" w:sz="4"/>
+            </w:tcBorders>
             <w:shd w:fill="FBEEE6" w:color="auto" w:val="clear"/>
             <w:tcMar>
               <w:top w:type="dxa" w:w="60"/>
@@ -7839,49 +7882,6 @@
                 <w:szCs w:val="18"/>
               </w:rPr>
               <w:t xml:space="preserve"> · Toetsweekplan C afronden met doelcheck en overgang. LOB 2-reflectie afmaken. MOL-gesprek 3 voorbereiden en vóór de toetsweek thuis laten zien.</w:t>
-            </w:r>
-          </w:p>
-        </w:tc>
-        <w:tc>
-          <w:tcPr>
-            <w:tcW w:type="dxa" w:w="5600"/>
-            <w:tcBorders>
-              <w:top w:val="single" w:color="C9C4B5" w:sz="4"/>
-              <w:left w:val="single" w:color="C9C4B5" w:sz="4"/>
-              <w:bottom w:val="single" w:color="C9C4B5" w:sz="4"/>
-              <w:right w:val="single" w:color="C9C4B5" w:sz="4"/>
-            </w:tcBorders>
-            <w:tcMar>
-              <w:top w:type="dxa" w:w="60"/>
-              <w:left w:type="dxa" w:w="90"/>
-              <w:bottom w:type="dxa" w:w="60"/>
-              <w:right w:type="dxa" w:w="90"/>
-            </w:tcMar>
-            <w:vAlign w:val="top"/>
-          </w:tcPr>
-          <w:p>
-            <w:pPr>
-              <w:spacing w:after="40"/>
-            </w:pPr>
-            <w:r>
-              <w:rPr>
-                <w:rFonts w:ascii="Calibri" w:cs="Calibri" w:eastAsia="Calibri" w:hAnsi="Calibri"/>
-                <w:b/>
-                <w:bCs/>
-                <w:color w:val="1F2328"/>
-                <w:sz w:val="18"/>
-                <w:szCs w:val="18"/>
-              </w:rPr>
-              <w:t xml:space="preserve">Thuis</w:t>
-            </w:r>
-            <w:r>
-              <w:rPr>
-                <w:rFonts w:ascii="Calibri" w:cs="Calibri" w:eastAsia="Calibri" w:hAnsi="Calibri"/>
-                <w:color w:val="1F2328"/>
-                <w:sz w:val="18"/>
-                <w:szCs w:val="18"/>
-              </w:rPr>
-              <w:t xml:space="preserve"> · Toetsweekplan C afronden met doelcheck en overgang. LOB deel 2 inleveren, LOB 2-reflectie afmaken. MOL-gesprek 3 voorbereiden en vóór de toetsweek thuis laten zien.</w:t>
             </w:r>
           </w:p>
         </w:tc>
@@ -8328,6 +8328,50 @@
               <w:bottom w:val="single" w:color="C9C4B5" w:sz="4"/>
               <w:right w:val="single" w:color="C9C4B5" w:sz="4"/>
             </w:tcBorders>
+            <w:shd w:fill="EFE9F7" w:color="auto" w:val="clear"/>
+            <w:tcMar>
+              <w:top w:type="dxa" w:w="60"/>
+              <w:left w:type="dxa" w:w="90"/>
+              <w:bottom w:type="dxa" w:w="60"/>
+              <w:right w:type="dxa" w:w="90"/>
+            </w:tcMar>
+            <w:vAlign w:val="top"/>
+          </w:tcPr>
+          <w:p>
+            <w:pPr>
+              <w:spacing w:after="40"/>
+            </w:pPr>
+            <w:r>
+              <w:rPr>
+                <w:rFonts w:ascii="Calibri" w:cs="Calibri" w:eastAsia="Calibri" w:hAnsi="Calibri"/>
+                <w:b/>
+                <w:bCs/>
+                <w:color w:val="1F2328"/>
+                <w:sz w:val="18"/>
+                <w:szCs w:val="18"/>
+              </w:rPr>
+              <w:t xml:space="preserve">In de klas</w:t>
+            </w:r>
+            <w:r>
+              <w:rPr>
+                <w:rFonts w:ascii="Calibri" w:cs="Calibri" w:eastAsia="Calibri" w:hAnsi="Calibri"/>
+                <w:color w:val="1F2328"/>
+                <w:sz w:val="18"/>
+                <w:szCs w:val="18"/>
+              </w:rPr>
+              <w:t xml:space="preserve"> · Na het MOL-gesprek: afspraken invullen en terugkijken. Uitleg eindpitch.</w:t>
+            </w:r>
+          </w:p>
+        </w:tc>
+        <w:tc>
+          <w:tcPr>
+            <w:tcW w:type="dxa" w:w="5600"/>
+            <w:tcBorders>
+              <w:top w:val="single" w:color="C9C4B5" w:sz="4"/>
+              <w:left w:val="single" w:color="C9C4B5" w:sz="4"/>
+              <w:bottom w:val="single" w:color="C9C4B5" w:sz="4"/>
+              <w:right w:val="single" w:color="C9C4B5" w:sz="4"/>
+            </w:tcBorders>
             <w:tcMar>
               <w:top w:type="dxa" w:w="60"/>
               <w:left w:type="dxa" w:w="90"/>
@@ -8359,50 +8403,6 @@
                 <w:szCs w:val="18"/>
               </w:rPr>
               <w:t xml:space="preserve"> · Na het MOL-gesprek: afspraken invullen en terugkijken. Terugblik toetsweek C: organisatie.</w:t>
-            </w:r>
-          </w:p>
-        </w:tc>
-        <w:tc>
-          <w:tcPr>
-            <w:tcW w:type="dxa" w:w="5600"/>
-            <w:tcBorders>
-              <w:top w:val="single" w:color="C9C4B5" w:sz="4"/>
-              <w:left w:val="single" w:color="C9C4B5" w:sz="4"/>
-              <w:bottom w:val="single" w:color="C9C4B5" w:sz="4"/>
-              <w:right w:val="single" w:color="C9C4B5" w:sz="4"/>
-            </w:tcBorders>
-            <w:shd w:fill="EFE9F7" w:color="auto" w:val="clear"/>
-            <w:tcMar>
-              <w:top w:type="dxa" w:w="60"/>
-              <w:left w:type="dxa" w:w="90"/>
-              <w:bottom w:type="dxa" w:w="60"/>
-              <w:right w:type="dxa" w:w="90"/>
-            </w:tcMar>
-            <w:vAlign w:val="top"/>
-          </w:tcPr>
-          <w:p>
-            <w:pPr>
-              <w:spacing w:after="40"/>
-            </w:pPr>
-            <w:r>
-              <w:rPr>
-                <w:rFonts w:ascii="Calibri" w:cs="Calibri" w:eastAsia="Calibri" w:hAnsi="Calibri"/>
-                <w:b/>
-                <w:bCs/>
-                <w:color w:val="1F2328"/>
-                <w:sz w:val="18"/>
-                <w:szCs w:val="18"/>
-              </w:rPr>
-              <w:t xml:space="preserve">In de klas</w:t>
-            </w:r>
-            <w:r>
-              <w:rPr>
-                <w:rFonts w:ascii="Calibri" w:cs="Calibri" w:eastAsia="Calibri" w:hAnsi="Calibri"/>
-                <w:color w:val="1F2328"/>
-                <w:sz w:val="18"/>
-                <w:szCs w:val="18"/>
-              </w:rPr>
-              <w:t xml:space="preserve"> · Na het MOL-gesprek: afspraken invullen en terugkijken. Uitleg eindpitch.</w:t>
             </w:r>
           </w:p>
         </w:tc>
@@ -8518,6 +8518,49 @@
               <w:bottom w:val="single" w:color="C9C4B5" w:sz="4"/>
               <w:right w:val="single" w:color="C9C4B5" w:sz="4"/>
             </w:tcBorders>
+            <w:tcMar>
+              <w:top w:type="dxa" w:w="60"/>
+              <w:left w:type="dxa" w:w="90"/>
+              <w:bottom w:type="dxa" w:w="60"/>
+              <w:right w:type="dxa" w:w="90"/>
+            </w:tcMar>
+            <w:vAlign w:val="top"/>
+          </w:tcPr>
+          <w:p>
+            <w:pPr>
+              <w:spacing w:after="40"/>
+            </w:pPr>
+            <w:r>
+              <w:rPr>
+                <w:rFonts w:ascii="Calibri" w:cs="Calibri" w:eastAsia="Calibri" w:hAnsi="Calibri"/>
+                <w:b/>
+                <w:bCs/>
+                <w:color w:val="1F2328"/>
+                <w:sz w:val="18"/>
+                <w:szCs w:val="18"/>
+              </w:rPr>
+              <w:t xml:space="preserve">Thuis</w:t>
+            </w:r>
+            <w:r>
+              <w:rPr>
+                <w:rFonts w:ascii="Calibri" w:cs="Calibri" w:eastAsia="Calibri" w:hAnsi="Calibri"/>
+                <w:color w:val="1F2328"/>
+                <w:sz w:val="18"/>
+                <w:szCs w:val="18"/>
+              </w:rPr>
+              <w:t xml:space="preserve"> · Terugblik toetsweek C maken, met je cijfers. Eerste idee voor je pitch. Wil je herkansen? Schrijf je uiterlijk ma 19 apr 12.00 uur in.</w:t>
+            </w:r>
+          </w:p>
+        </w:tc>
+        <w:tc>
+          <w:tcPr>
+            <w:tcW w:type="dxa" w:w="5600"/>
+            <w:tcBorders>
+              <w:top w:val="single" w:color="C9C4B5" w:sz="4"/>
+              <w:left w:val="single" w:color="C9C4B5" w:sz="4"/>
+              <w:bottom w:val="single" w:color="C9C4B5" w:sz="4"/>
+              <w:right w:val="single" w:color="C9C4B5" w:sz="4"/>
+            </w:tcBorders>
             <w:shd w:fill="EFE9F7" w:color="auto" w:val="clear"/>
             <w:tcMar>
               <w:top w:type="dxa" w:w="60"/>
@@ -8550,49 +8593,6 @@
                 <w:szCs w:val="18"/>
               </w:rPr>
               <w:t xml:space="preserve"> · Terugblik toetsweek C. Uitleg eindpitch. Wil je herkansen? Schrijf je uiterlijk ma 19 apr 12.00 uur in.</w:t>
-            </w:r>
-          </w:p>
-        </w:tc>
-        <w:tc>
-          <w:tcPr>
-            <w:tcW w:type="dxa" w:w="5600"/>
-            <w:tcBorders>
-              <w:top w:val="single" w:color="C9C4B5" w:sz="4"/>
-              <w:left w:val="single" w:color="C9C4B5" w:sz="4"/>
-              <w:bottom w:val="single" w:color="C9C4B5" w:sz="4"/>
-              <w:right w:val="single" w:color="C9C4B5" w:sz="4"/>
-            </w:tcBorders>
-            <w:tcMar>
-              <w:top w:type="dxa" w:w="60"/>
-              <w:left w:type="dxa" w:w="90"/>
-              <w:bottom w:type="dxa" w:w="60"/>
-              <w:right w:type="dxa" w:w="90"/>
-            </w:tcMar>
-            <w:vAlign w:val="top"/>
-          </w:tcPr>
-          <w:p>
-            <w:pPr>
-              <w:spacing w:after="40"/>
-            </w:pPr>
-            <w:r>
-              <w:rPr>
-                <w:rFonts w:ascii="Calibri" w:cs="Calibri" w:eastAsia="Calibri" w:hAnsi="Calibri"/>
-                <w:b/>
-                <w:bCs/>
-                <w:color w:val="1F2328"/>
-                <w:sz w:val="18"/>
-                <w:szCs w:val="18"/>
-              </w:rPr>
-              <w:t xml:space="preserve">Thuis</w:t>
-            </w:r>
-            <w:r>
-              <w:rPr>
-                <w:rFonts w:ascii="Calibri" w:cs="Calibri" w:eastAsia="Calibri" w:hAnsi="Calibri"/>
-                <w:color w:val="1F2328"/>
-                <w:sz w:val="18"/>
-                <w:szCs w:val="18"/>
-              </w:rPr>
-              <w:t xml:space="preserve"> · Terugblik toetsweek C maken, met je cijfers. Eerste idee voor je pitch. Wil je herkansen? Schrijf je uiterlijk ma 19 apr 12.00 uur in.</w:t>
             </w:r>
           </w:p>
         </w:tc>
@@ -8724,6 +8724,50 @@
               <w:bottom w:val="single" w:color="C9C4B5" w:sz="4"/>
               <w:right w:val="single" w:color="C9C4B5" w:sz="4"/>
             </w:tcBorders>
+            <w:shd w:fill="EFE9F7" w:color="auto" w:val="clear"/>
+            <w:tcMar>
+              <w:top w:type="dxa" w:w="60"/>
+              <w:left w:type="dxa" w:w="90"/>
+              <w:bottom w:type="dxa" w:w="60"/>
+              <w:right w:type="dxa" w:w="90"/>
+            </w:tcMar>
+            <w:vAlign w:val="top"/>
+          </w:tcPr>
+          <w:p>
+            <w:pPr>
+              <w:spacing w:after="40"/>
+            </w:pPr>
+            <w:r>
+              <w:rPr>
+                <w:rFonts w:ascii="Calibri" w:cs="Calibri" w:eastAsia="Calibri" w:hAnsi="Calibri"/>
+                <w:b/>
+                <w:bCs/>
+                <w:color w:val="1F2328"/>
+                <w:sz w:val="18"/>
+                <w:szCs w:val="18"/>
+              </w:rPr>
+              <w:t xml:space="preserve">In de klas</w:t>
+            </w:r>
+            <w:r>
+              <w:rPr>
+                <w:rFonts w:ascii="Calibri" w:cs="Calibri" w:eastAsia="Calibri" w:hAnsi="Calibri"/>
+                <w:color w:val="1F2328"/>
+                <w:sz w:val="18"/>
+                <w:szCs w:val="18"/>
+              </w:rPr>
+              <w:t xml:space="preserve"> · Check of je inschrijving voor de herkansing gelukt is. Opzet pitch.</w:t>
+            </w:r>
+          </w:p>
+        </w:tc>
+        <w:tc>
+          <w:tcPr>
+            <w:tcW w:type="dxa" w:w="5600"/>
+            <w:tcBorders>
+              <w:top w:val="single" w:color="C9C4B5" w:sz="4"/>
+              <w:left w:val="single" w:color="C9C4B5" w:sz="4"/>
+              <w:bottom w:val="single" w:color="C9C4B5" w:sz="4"/>
+              <w:right w:val="single" w:color="C9C4B5" w:sz="4"/>
+            </w:tcBorders>
             <w:tcMar>
               <w:top w:type="dxa" w:w="60"/>
               <w:left w:type="dxa" w:w="90"/>
@@ -8755,50 +8799,6 @@
                 <w:szCs w:val="18"/>
               </w:rPr>
               <w:t xml:space="preserve"> · Opzet pitch maken.</w:t>
-            </w:r>
-          </w:p>
-        </w:tc>
-        <w:tc>
-          <w:tcPr>
-            <w:tcW w:type="dxa" w:w="5600"/>
-            <w:tcBorders>
-              <w:top w:val="single" w:color="C9C4B5" w:sz="4"/>
-              <w:left w:val="single" w:color="C9C4B5" w:sz="4"/>
-              <w:bottom w:val="single" w:color="C9C4B5" w:sz="4"/>
-              <w:right w:val="single" w:color="C9C4B5" w:sz="4"/>
-            </w:tcBorders>
-            <w:shd w:fill="EFE9F7" w:color="auto" w:val="clear"/>
-            <w:tcMar>
-              <w:top w:type="dxa" w:w="60"/>
-              <w:left w:type="dxa" w:w="90"/>
-              <w:bottom w:type="dxa" w:w="60"/>
-              <w:right w:type="dxa" w:w="90"/>
-            </w:tcMar>
-            <w:vAlign w:val="top"/>
-          </w:tcPr>
-          <w:p>
-            <w:pPr>
-              <w:spacing w:after="40"/>
-            </w:pPr>
-            <w:r>
-              <w:rPr>
-                <w:rFonts w:ascii="Calibri" w:cs="Calibri" w:eastAsia="Calibri" w:hAnsi="Calibri"/>
-                <w:b/>
-                <w:bCs/>
-                <w:color w:val="1F2328"/>
-                <w:sz w:val="18"/>
-                <w:szCs w:val="18"/>
-              </w:rPr>
-              <w:t xml:space="preserve">In de klas</w:t>
-            </w:r>
-            <w:r>
-              <w:rPr>
-                <w:rFonts w:ascii="Calibri" w:cs="Calibri" w:eastAsia="Calibri" w:hAnsi="Calibri"/>
-                <w:color w:val="1F2328"/>
-                <w:sz w:val="18"/>
-                <w:szCs w:val="18"/>
-              </w:rPr>
-              <w:t xml:space="preserve"> · Check of je inschrijving voor de herkansing gelukt is. Opzet pitch.</w:t>
             </w:r>
           </w:p>
         </w:tc>
@@ -9085,6 +9085,49 @@
               <w:bottom w:val="single" w:color="C9C4B5" w:sz="4"/>
               <w:right w:val="single" w:color="C9C4B5" w:sz="4"/>
             </w:tcBorders>
+            <w:tcMar>
+              <w:top w:type="dxa" w:w="60"/>
+              <w:left w:type="dxa" w:w="90"/>
+              <w:bottom w:type="dxa" w:w="60"/>
+              <w:right w:type="dxa" w:w="90"/>
+            </w:tcMar>
+            <w:vAlign w:val="top"/>
+          </w:tcPr>
+          <w:p>
+            <w:pPr>
+              <w:spacing w:after="40"/>
+            </w:pPr>
+            <w:r>
+              <w:rPr>
+                <w:rFonts w:ascii="Calibri" w:cs="Calibri" w:eastAsia="Calibri" w:hAnsi="Calibri"/>
+                <w:b/>
+                <w:bCs/>
+                <w:color w:val="1F2328"/>
+                <w:sz w:val="18"/>
+                <w:szCs w:val="18"/>
+              </w:rPr>
+              <w:t xml:space="preserve">Thuis</w:t>
+            </w:r>
+            <w:r>
+              <w:rPr>
+                <w:rFonts w:ascii="Calibri" w:cs="Calibri" w:eastAsia="Calibri" w:hAnsi="Calibri"/>
+                <w:color w:val="1F2328"/>
+                <w:sz w:val="18"/>
+                <w:szCs w:val="18"/>
+              </w:rPr>
+              <w:t xml:space="preserve"> · Pitch uitwerken.</w:t>
+            </w:r>
+          </w:p>
+        </w:tc>
+        <w:tc>
+          <w:tcPr>
+            <w:tcW w:type="dxa" w:w="5600"/>
+            <w:tcBorders>
+              <w:top w:val="single" w:color="C9C4B5" w:sz="4"/>
+              <w:left w:val="single" w:color="C9C4B5" w:sz="4"/>
+              <w:bottom w:val="single" w:color="C9C4B5" w:sz="4"/>
+              <w:right w:val="single" w:color="C9C4B5" w:sz="4"/>
+            </w:tcBorders>
             <w:shd w:fill="EFE9F7" w:color="auto" w:val="clear"/>
             <w:tcMar>
               <w:top w:type="dxa" w:w="60"/>
@@ -9117,49 +9160,6 @@
                 <w:szCs w:val="18"/>
               </w:rPr>
               <w:t xml:space="preserve"> · Pitch aanscherpen en oefenen.</w:t>
-            </w:r>
-          </w:p>
-        </w:tc>
-        <w:tc>
-          <w:tcPr>
-            <w:tcW w:type="dxa" w:w="5600"/>
-            <w:tcBorders>
-              <w:top w:val="single" w:color="C9C4B5" w:sz="4"/>
-              <w:left w:val="single" w:color="C9C4B5" w:sz="4"/>
-              <w:bottom w:val="single" w:color="C9C4B5" w:sz="4"/>
-              <w:right w:val="single" w:color="C9C4B5" w:sz="4"/>
-            </w:tcBorders>
-            <w:tcMar>
-              <w:top w:type="dxa" w:w="60"/>
-              <w:left w:type="dxa" w:w="90"/>
-              <w:bottom w:type="dxa" w:w="60"/>
-              <w:right w:type="dxa" w:w="90"/>
-            </w:tcMar>
-            <w:vAlign w:val="top"/>
-          </w:tcPr>
-          <w:p>
-            <w:pPr>
-              <w:spacing w:after="40"/>
-            </w:pPr>
-            <w:r>
-              <w:rPr>
-                <w:rFonts w:ascii="Calibri" w:cs="Calibri" w:eastAsia="Calibri" w:hAnsi="Calibri"/>
-                <w:b/>
-                <w:bCs/>
-                <w:color w:val="1F2328"/>
-                <w:sz w:val="18"/>
-                <w:szCs w:val="18"/>
-              </w:rPr>
-              <w:t xml:space="preserve">Thuis</w:t>
-            </w:r>
-            <w:r>
-              <w:rPr>
-                <w:rFonts w:ascii="Calibri" w:cs="Calibri" w:eastAsia="Calibri" w:hAnsi="Calibri"/>
-                <w:color w:val="1F2328"/>
-                <w:sz w:val="18"/>
-                <w:szCs w:val="18"/>
-              </w:rPr>
-              <w:t xml:space="preserve"> · Pitch uitwerken.</w:t>
             </w:r>
           </w:p>
         </w:tc>
@@ -9262,6 +9262,50 @@
               <w:bottom w:val="single" w:color="C9C4B5" w:sz="4"/>
               <w:right w:val="single" w:color="C9C4B5" w:sz="4"/>
             </w:tcBorders>
+            <w:shd w:fill="EFE9F7" w:color="auto" w:val="clear"/>
+            <w:tcMar>
+              <w:top w:type="dxa" w:w="60"/>
+              <w:left w:type="dxa" w:w="90"/>
+              <w:bottom w:type="dxa" w:w="60"/>
+              <w:right w:type="dxa" w:w="90"/>
+            </w:tcMar>
+            <w:vAlign w:val="top"/>
+          </w:tcPr>
+          <w:p>
+            <w:pPr>
+              <w:spacing w:after="40"/>
+            </w:pPr>
+            <w:r>
+              <w:rPr>
+                <w:rFonts w:ascii="Calibri" w:cs="Calibri" w:eastAsia="Calibri" w:hAnsi="Calibri"/>
+                <w:b/>
+                <w:bCs/>
+                <w:color w:val="1F2328"/>
+                <w:sz w:val="18"/>
+                <w:szCs w:val="18"/>
+              </w:rPr>
+              <w:t xml:space="preserve">In de klas</w:t>
+            </w:r>
+            <w:r>
+              <w:rPr>
+                <w:rFonts w:ascii="Calibri" w:cs="Calibri" w:eastAsia="Calibri" w:hAnsi="Calibri"/>
+                <w:color w:val="1F2328"/>
+                <w:sz w:val="18"/>
+                <w:szCs w:val="18"/>
+              </w:rPr>
+              <w:t xml:space="preserve"> · Pitch aanscherpen en oefenen.</w:t>
+            </w:r>
+          </w:p>
+        </w:tc>
+        <w:tc>
+          <w:tcPr>
+            <w:tcW w:type="dxa" w:w="5600"/>
+            <w:tcBorders>
+              <w:top w:val="single" w:color="C9C4B5" w:sz="4"/>
+              <w:left w:val="single" w:color="C9C4B5" w:sz="4"/>
+              <w:bottom w:val="single" w:color="C9C4B5" w:sz="4"/>
+              <w:right w:val="single" w:color="C9C4B5" w:sz="4"/>
+            </w:tcBorders>
             <w:tcMar>
               <w:top w:type="dxa" w:w="60"/>
               <w:left w:type="dxa" w:w="90"/>
@@ -9293,50 +9337,6 @@
                 <w:szCs w:val="18"/>
               </w:rPr>
               <w:t xml:space="preserve"> · Pitch oefenen, binnen 5 minuten.</w:t>
-            </w:r>
-          </w:p>
-        </w:tc>
-        <w:tc>
-          <w:tcPr>
-            <w:tcW w:type="dxa" w:w="5600"/>
-            <w:tcBorders>
-              <w:top w:val="single" w:color="C9C4B5" w:sz="4"/>
-              <w:left w:val="single" w:color="C9C4B5" w:sz="4"/>
-              <w:bottom w:val="single" w:color="C9C4B5" w:sz="4"/>
-              <w:right w:val="single" w:color="C9C4B5" w:sz="4"/>
-            </w:tcBorders>
-            <w:shd w:fill="EFE9F7" w:color="auto" w:val="clear"/>
-            <w:tcMar>
-              <w:top w:type="dxa" w:w="60"/>
-              <w:left w:type="dxa" w:w="90"/>
-              <w:bottom w:type="dxa" w:w="60"/>
-              <w:right w:type="dxa" w:w="90"/>
-            </w:tcMar>
-            <w:vAlign w:val="top"/>
-          </w:tcPr>
-          <w:p>
-            <w:pPr>
-              <w:spacing w:after="40"/>
-            </w:pPr>
-            <w:r>
-              <w:rPr>
-                <w:rFonts w:ascii="Calibri" w:cs="Calibri" w:eastAsia="Calibri" w:hAnsi="Calibri"/>
-                <w:b/>
-                <w:bCs/>
-                <w:color w:val="1F2328"/>
-                <w:sz w:val="18"/>
-                <w:szCs w:val="18"/>
-              </w:rPr>
-              <w:t xml:space="preserve">In de klas</w:t>
-            </w:r>
-            <w:r>
-              <w:rPr>
-                <w:rFonts w:ascii="Calibri" w:cs="Calibri" w:eastAsia="Calibri" w:hAnsi="Calibri"/>
-                <w:color w:val="1F2328"/>
-                <w:sz w:val="18"/>
-                <w:szCs w:val="18"/>
-              </w:rPr>
-              <w:t xml:space="preserve"> · Pitch aanscherpen en oefenen.</w:t>
             </w:r>
           </w:p>
         </w:tc>
@@ -9452,6 +9452,49 @@
               <w:bottom w:val="single" w:color="C9C4B5" w:sz="4"/>
               <w:right w:val="single" w:color="C9C4B5" w:sz="4"/>
             </w:tcBorders>
+            <w:tcMar>
+              <w:top w:type="dxa" w:w="60"/>
+              <w:left w:type="dxa" w:w="90"/>
+              <w:bottom w:type="dxa" w:w="60"/>
+              <w:right w:type="dxa" w:w="90"/>
+            </w:tcMar>
+            <w:vAlign w:val="top"/>
+          </w:tcPr>
+          <w:p>
+            <w:pPr>
+              <w:spacing w:after="40"/>
+            </w:pPr>
+            <w:r>
+              <w:rPr>
+                <w:rFonts w:ascii="Calibri" w:cs="Calibri" w:eastAsia="Calibri" w:hAnsi="Calibri"/>
+                <w:b/>
+                <w:bCs/>
+                <w:color w:val="1F2328"/>
+                <w:sz w:val="18"/>
+                <w:szCs w:val="18"/>
+              </w:rPr>
+              <w:t xml:space="preserve">Thuis</w:t>
+            </w:r>
+            <w:r>
+              <w:rPr>
+                <w:rFonts w:ascii="Calibri" w:cs="Calibri" w:eastAsia="Calibri" w:hAnsi="Calibri"/>
+                <w:color w:val="1F2328"/>
+                <w:sz w:val="18"/>
+                <w:szCs w:val="18"/>
+              </w:rPr>
+              <w:t xml:space="preserve"> · Pitch afmaken en oefenen.</w:t>
+            </w:r>
+          </w:p>
+        </w:tc>
+        <w:tc>
+          <w:tcPr>
+            <w:tcW w:type="dxa" w:w="5600"/>
+            <w:tcBorders>
+              <w:top w:val="single" w:color="C9C4B5" w:sz="4"/>
+              <w:left w:val="single" w:color="C9C4B5" w:sz="4"/>
+              <w:bottom w:val="single" w:color="C9C4B5" w:sz="4"/>
+              <w:right w:val="single" w:color="C9C4B5" w:sz="4"/>
+            </w:tcBorders>
             <w:shd w:fill="EFE9F7" w:color="auto" w:val="clear"/>
             <w:tcMar>
               <w:top w:type="dxa" w:w="60"/>
@@ -9484,49 +9527,6 @@
                 <w:szCs w:val="18"/>
               </w:rPr>
               <w:t xml:space="preserve"> · Pitch geven.</w:t>
-            </w:r>
-          </w:p>
-        </w:tc>
-        <w:tc>
-          <w:tcPr>
-            <w:tcW w:type="dxa" w:w="5600"/>
-            <w:tcBorders>
-              <w:top w:val="single" w:color="C9C4B5" w:sz="4"/>
-              <w:left w:val="single" w:color="C9C4B5" w:sz="4"/>
-              <w:bottom w:val="single" w:color="C9C4B5" w:sz="4"/>
-              <w:right w:val="single" w:color="C9C4B5" w:sz="4"/>
-            </w:tcBorders>
-            <w:tcMar>
-              <w:top w:type="dxa" w:w="60"/>
-              <w:left w:type="dxa" w:w="90"/>
-              <w:bottom w:type="dxa" w:w="60"/>
-              <w:right w:type="dxa" w:w="90"/>
-            </w:tcMar>
-            <w:vAlign w:val="top"/>
-          </w:tcPr>
-          <w:p>
-            <w:pPr>
-              <w:spacing w:after="40"/>
-            </w:pPr>
-            <w:r>
-              <w:rPr>
-                <w:rFonts w:ascii="Calibri" w:cs="Calibri" w:eastAsia="Calibri" w:hAnsi="Calibri"/>
-                <w:b/>
-                <w:bCs/>
-                <w:color w:val="1F2328"/>
-                <w:sz w:val="18"/>
-                <w:szCs w:val="18"/>
-              </w:rPr>
-              <w:t xml:space="preserve">Thuis</w:t>
-            </w:r>
-            <w:r>
-              <w:rPr>
-                <w:rFonts w:ascii="Calibri" w:cs="Calibri" w:eastAsia="Calibri" w:hAnsi="Calibri"/>
-                <w:color w:val="1F2328"/>
-                <w:sz w:val="18"/>
-                <w:szCs w:val="18"/>
-              </w:rPr>
-              <w:t xml:space="preserve"> · Pitch afmaken en oefenen.</w:t>
             </w:r>
           </w:p>
         </w:tc>
@@ -9629,6 +9629,50 @@
               <w:bottom w:val="single" w:color="C9C4B5" w:sz="4"/>
               <w:right w:val="single" w:color="C9C4B5" w:sz="4"/>
             </w:tcBorders>
+            <w:shd w:fill="EFE9F7" w:color="auto" w:val="clear"/>
+            <w:tcMar>
+              <w:top w:type="dxa" w:w="60"/>
+              <w:left w:type="dxa" w:w="90"/>
+              <w:bottom w:type="dxa" w:w="60"/>
+              <w:right w:type="dxa" w:w="90"/>
+            </w:tcMar>
+            <w:vAlign w:val="top"/>
+          </w:tcPr>
+          <w:p>
+            <w:pPr>
+              <w:spacing w:after="40"/>
+            </w:pPr>
+            <w:r>
+              <w:rPr>
+                <w:rFonts w:ascii="Calibri" w:cs="Calibri" w:eastAsia="Calibri" w:hAnsi="Calibri"/>
+                <w:b/>
+                <w:bCs/>
+                <w:color w:val="1F2328"/>
+                <w:sz w:val="18"/>
+                <w:szCs w:val="18"/>
+              </w:rPr>
+              <w:t xml:space="preserve">In de klas</w:t>
+            </w:r>
+            <w:r>
+              <w:rPr>
+                <w:rFonts w:ascii="Calibri" w:cs="Calibri" w:eastAsia="Calibri" w:hAnsi="Calibri"/>
+                <w:color w:val="1F2328"/>
+                <w:sz w:val="18"/>
+                <w:szCs w:val="18"/>
+              </w:rPr>
+              <w:t xml:space="preserve"> · Pitch geven. LOB 3-reflectie uiterlijk vr 4 jun.</w:t>
+            </w:r>
+          </w:p>
+        </w:tc>
+        <w:tc>
+          <w:tcPr>
+            <w:tcW w:type="dxa" w:w="5600"/>
+            <w:tcBorders>
+              <w:top w:val="single" w:color="C9C4B5" w:sz="4"/>
+              <w:left w:val="single" w:color="C9C4B5" w:sz="4"/>
+              <w:bottom w:val="single" w:color="C9C4B5" w:sz="4"/>
+              <w:right w:val="single" w:color="C9C4B5" w:sz="4"/>
+            </w:tcBorders>
             <w:tcMar>
               <w:top w:type="dxa" w:w="60"/>
               <w:left w:type="dxa" w:w="90"/>
@@ -9660,50 +9704,6 @@
                 <w:szCs w:val="18"/>
               </w:rPr>
               <w:t xml:space="preserve"> · LOB 3-reflectie in de tool.</w:t>
-            </w:r>
-          </w:p>
-        </w:tc>
-        <w:tc>
-          <w:tcPr>
-            <w:tcW w:type="dxa" w:w="5600"/>
-            <w:tcBorders>
-              <w:top w:val="single" w:color="C9C4B5" w:sz="4"/>
-              <w:left w:val="single" w:color="C9C4B5" w:sz="4"/>
-              <w:bottom w:val="single" w:color="C9C4B5" w:sz="4"/>
-              <w:right w:val="single" w:color="C9C4B5" w:sz="4"/>
-            </w:tcBorders>
-            <w:shd w:fill="EFE9F7" w:color="auto" w:val="clear"/>
-            <w:tcMar>
-              <w:top w:type="dxa" w:w="60"/>
-              <w:left w:type="dxa" w:w="90"/>
-              <w:bottom w:type="dxa" w:w="60"/>
-              <w:right w:type="dxa" w:w="90"/>
-            </w:tcMar>
-            <w:vAlign w:val="top"/>
-          </w:tcPr>
-          <w:p>
-            <w:pPr>
-              <w:spacing w:after="40"/>
-            </w:pPr>
-            <w:r>
-              <w:rPr>
-                <w:rFonts w:ascii="Calibri" w:cs="Calibri" w:eastAsia="Calibri" w:hAnsi="Calibri"/>
-                <w:b/>
-                <w:bCs/>
-                <w:color w:val="1F2328"/>
-                <w:sz w:val="18"/>
-                <w:szCs w:val="18"/>
-              </w:rPr>
-              <w:t xml:space="preserve">In de klas</w:t>
-            </w:r>
-            <w:r>
-              <w:rPr>
-                <w:rFonts w:ascii="Calibri" w:cs="Calibri" w:eastAsia="Calibri" w:hAnsi="Calibri"/>
-                <w:color w:val="1F2328"/>
-                <w:sz w:val="18"/>
-                <w:szCs w:val="18"/>
-              </w:rPr>
-              <w:t xml:space="preserve"> · Pitch geven. LOB 3-reflectie uiterlijk vr 4 jun.</w:t>
             </w:r>
           </w:p>
         </w:tc>
@@ -9835,6 +9835,49 @@
               <w:bottom w:val="single" w:color="C9C4B5" w:sz="4"/>
               <w:right w:val="single" w:color="C9C4B5" w:sz="4"/>
             </w:tcBorders>
+            <w:tcMar>
+              <w:top w:type="dxa" w:w="60"/>
+              <w:left w:type="dxa" w:w="90"/>
+              <w:bottom w:type="dxa" w:w="60"/>
+              <w:right w:type="dxa" w:w="90"/>
+            </w:tcMar>
+            <w:vAlign w:val="top"/>
+          </w:tcPr>
+          <w:p>
+            <w:pPr>
+              <w:spacing w:after="40"/>
+            </w:pPr>
+            <w:r>
+              <w:rPr>
+                <w:rFonts w:ascii="Calibri" w:cs="Calibri" w:eastAsia="Calibri" w:hAnsi="Calibri"/>
+                <w:b/>
+                <w:bCs/>
+                <w:color w:val="1F2328"/>
+                <w:sz w:val="18"/>
+                <w:szCs w:val="18"/>
+              </w:rPr>
+              <w:t xml:space="preserve">Thuis</w:t>
+            </w:r>
+            <w:r>
+              <w:rPr>
+                <w:rFonts w:ascii="Calibri" w:cs="Calibri" w:eastAsia="Calibri" w:hAnsi="Calibri"/>
+                <w:color w:val="1F2328"/>
+                <w:sz w:val="18"/>
+                <w:szCs w:val="18"/>
+              </w:rPr>
+              <w:t xml:space="preserve"> · LOB 3-reflectie (als dat nog niet klaar is). Toetsweekplan D.</w:t>
+            </w:r>
+          </w:p>
+        </w:tc>
+        <w:tc>
+          <w:tcPr>
+            <w:tcW w:type="dxa" w:w="5600"/>
+            <w:tcBorders>
+              <w:top w:val="single" w:color="C9C4B5" w:sz="4"/>
+              <w:left w:val="single" w:color="C9C4B5" w:sz="4"/>
+              <w:bottom w:val="single" w:color="C9C4B5" w:sz="4"/>
+              <w:right w:val="single" w:color="C9C4B5" w:sz="4"/>
+            </w:tcBorders>
             <w:shd w:fill="FBEEE6" w:color="auto" w:val="clear"/>
             <w:tcMar>
               <w:top w:type="dxa" w:w="60"/>
@@ -9867,49 +9910,6 @@
                 <w:szCs w:val="18"/>
               </w:rPr>
               <w:t xml:space="preserve"> · Toetsweekplan D. Eindbalans stap 1 tot en met 3.</w:t>
-            </w:r>
-          </w:p>
-        </w:tc>
-        <w:tc>
-          <w:tcPr>
-            <w:tcW w:type="dxa" w:w="5600"/>
-            <w:tcBorders>
-              <w:top w:val="single" w:color="C9C4B5" w:sz="4"/>
-              <w:left w:val="single" w:color="C9C4B5" w:sz="4"/>
-              <w:bottom w:val="single" w:color="C9C4B5" w:sz="4"/>
-              <w:right w:val="single" w:color="C9C4B5" w:sz="4"/>
-            </w:tcBorders>
-            <w:tcMar>
-              <w:top w:type="dxa" w:w="60"/>
-              <w:left w:type="dxa" w:w="90"/>
-              <w:bottom w:type="dxa" w:w="60"/>
-              <w:right w:type="dxa" w:w="90"/>
-            </w:tcMar>
-            <w:vAlign w:val="top"/>
-          </w:tcPr>
-          <w:p>
-            <w:pPr>
-              <w:spacing w:after="40"/>
-            </w:pPr>
-            <w:r>
-              <w:rPr>
-                <w:rFonts w:ascii="Calibri" w:cs="Calibri" w:eastAsia="Calibri" w:hAnsi="Calibri"/>
-                <w:b/>
-                <w:bCs/>
-                <w:color w:val="1F2328"/>
-                <w:sz w:val="18"/>
-                <w:szCs w:val="18"/>
-              </w:rPr>
-              <w:t xml:space="preserve">Thuis</w:t>
-            </w:r>
-            <w:r>
-              <w:rPr>
-                <w:rFonts w:ascii="Calibri" w:cs="Calibri" w:eastAsia="Calibri" w:hAnsi="Calibri"/>
-                <w:color w:val="1F2328"/>
-                <w:sz w:val="18"/>
-                <w:szCs w:val="18"/>
-              </w:rPr>
-              <w:t xml:space="preserve"> · LOB 3-reflectie (als dat nog niet klaar is). Toetsweekplan D.</w:t>
             </w:r>
           </w:p>
         </w:tc>
@@ -10012,6 +10012,50 @@
               <w:bottom w:val="single" w:color="C9C4B5" w:sz="4"/>
               <w:right w:val="single" w:color="C9C4B5" w:sz="4"/>
             </w:tcBorders>
+            <w:shd w:fill="FBEEE6" w:color="auto" w:val="clear"/>
+            <w:tcMar>
+              <w:top w:type="dxa" w:w="60"/>
+              <w:left w:type="dxa" w:w="90"/>
+              <w:bottom w:type="dxa" w:w="60"/>
+              <w:right w:type="dxa" w:w="90"/>
+            </w:tcMar>
+            <w:vAlign w:val="top"/>
+          </w:tcPr>
+          <w:p>
+            <w:pPr>
+              <w:spacing w:after="40"/>
+            </w:pPr>
+            <w:r>
+              <w:rPr>
+                <w:rFonts w:ascii="Calibri" w:cs="Calibri" w:eastAsia="Calibri" w:hAnsi="Calibri"/>
+                <w:b/>
+                <w:bCs/>
+                <w:color w:val="1F2328"/>
+                <w:sz w:val="18"/>
+                <w:szCs w:val="18"/>
+              </w:rPr>
+              <w:t xml:space="preserve">In de klas</w:t>
+            </w:r>
+            <w:r>
+              <w:rPr>
+                <w:rFonts w:ascii="Calibri" w:cs="Calibri" w:eastAsia="Calibri" w:hAnsi="Calibri"/>
+                <w:color w:val="1F2328"/>
+                <w:sz w:val="18"/>
+                <w:szCs w:val="18"/>
+              </w:rPr>
+              <w:t xml:space="preserve"> · Toetsweekplan D. Eindbalans stap 1 tot en met 3.</w:t>
+            </w:r>
+          </w:p>
+        </w:tc>
+        <w:tc>
+          <w:tcPr>
+            <w:tcW w:type="dxa" w:w="5600"/>
+            <w:tcBorders>
+              <w:top w:val="single" w:color="C9C4B5" w:sz="4"/>
+              <w:left w:val="single" w:color="C9C4B5" w:sz="4"/>
+              <w:bottom w:val="single" w:color="C9C4B5" w:sz="4"/>
+              <w:right w:val="single" w:color="C9C4B5" w:sz="4"/>
+            </w:tcBorders>
             <w:tcMar>
               <w:top w:type="dxa" w:w="60"/>
               <w:left w:type="dxa" w:w="90"/>
@@ -10043,50 +10087,6 @@
                 <w:szCs w:val="18"/>
               </w:rPr>
               <w:t xml:space="preserve"> · Toetsweekplan D: kolom ‘vlak ervoor’ bijwerken. Eindbalans stap 1 tot en met 3 afmaken.</w:t>
-            </w:r>
-          </w:p>
-        </w:tc>
-        <w:tc>
-          <w:tcPr>
-            <w:tcW w:type="dxa" w:w="5600"/>
-            <w:tcBorders>
-              <w:top w:val="single" w:color="C9C4B5" w:sz="4"/>
-              <w:left w:val="single" w:color="C9C4B5" w:sz="4"/>
-              <w:bottom w:val="single" w:color="C9C4B5" w:sz="4"/>
-              <w:right w:val="single" w:color="C9C4B5" w:sz="4"/>
-            </w:tcBorders>
-            <w:shd w:fill="FBEEE6" w:color="auto" w:val="clear"/>
-            <w:tcMar>
-              <w:top w:type="dxa" w:w="60"/>
-              <w:left w:type="dxa" w:w="90"/>
-              <w:bottom w:type="dxa" w:w="60"/>
-              <w:right w:type="dxa" w:w="90"/>
-            </w:tcMar>
-            <w:vAlign w:val="top"/>
-          </w:tcPr>
-          <w:p>
-            <w:pPr>
-              <w:spacing w:after="40"/>
-            </w:pPr>
-            <w:r>
-              <w:rPr>
-                <w:rFonts w:ascii="Calibri" w:cs="Calibri" w:eastAsia="Calibri" w:hAnsi="Calibri"/>
-                <w:b/>
-                <w:bCs/>
-                <w:color w:val="1F2328"/>
-                <w:sz w:val="18"/>
-                <w:szCs w:val="18"/>
-              </w:rPr>
-              <w:t xml:space="preserve">In de klas</w:t>
-            </w:r>
-            <w:r>
-              <w:rPr>
-                <w:rFonts w:ascii="Calibri" w:cs="Calibri" w:eastAsia="Calibri" w:hAnsi="Calibri"/>
-                <w:color w:val="1F2328"/>
-                <w:sz w:val="18"/>
-                <w:szCs w:val="18"/>
-              </w:rPr>
-              <w:t xml:space="preserve"> · Toetsweekplan D. Eindbalans stap 1 tot en met 3.</w:t>
             </w:r>
           </w:p>
         </w:tc>

</xml_diff>